<commit_message>
Docx formları: üst bilgi logosu kutusuna göre büyütüldü
Co-Authored-By: Claude Sonnet 5.5 <noreply@anthropic.com>
Claude-Session: https://claude.ai/code/session_01J6foNXTwf1dGzDjULYpfrk
</commit_message>
<xml_diff>
--- a/formlar/15. İç Denetim ve Yönetim Gözden Geçirme/EMS.YS.FRM.11.07. Toplantı Tutanağı Formu.docx
+++ b/formlar/15. İç Denetim ve Yönetim Gözden Geçirme/EMS.YS.FRM.11.07. Toplantı Tutanağı Formu.docx
@@ -2416,7 +2416,7 @@
             </w:rPr>
             <w:drawing>
               <wp:inline distT="0" distB="0" distL="0" distR="0" wp14:anchorId="151A8098" wp14:editId="34C3FA3F">
-                <wp:extent cx="723900" cy="631163"/>
+                <wp:extent cx="1100000" cy="959081"/>
                 <wp:effectExtent l="0" t="0" r="0" b="0"/>
                 <wp:docPr id="38064677" name="Picture 2"/>
                 <wp:cNvGraphicFramePr>
@@ -2447,7 +2447,7 @@
                       <pic:spPr bwMode="auto">
                         <a:xfrm>
                           <a:off x="0" y="0"/>
-                          <a:ext cx="750578" cy="654423"/>
+                          <a:ext cx="1140538" cy="994426"/>
                         </a:xfrm>
                         <a:prstGeom prst="rect">
                           <a:avLst/>

</xml_diff>

<commit_message>
Docx formları: üst bilgi logosu kutusuna göre büyütüldü (#460)
Claude-Session: https://claude.ai/code/session_01J6foNXTwf1dGzDjULYpfrk

Co-authored-by: Claude <noreply@anthropic.com>
</commit_message>
<xml_diff>
--- a/formlar/15. İç Denetim ve Yönetim Gözden Geçirme/EMS.YS.FRM.11.07. Toplantı Tutanağı Formu.docx
+++ b/formlar/15. İç Denetim ve Yönetim Gözden Geçirme/EMS.YS.FRM.11.07. Toplantı Tutanağı Formu.docx
@@ -2416,7 +2416,7 @@
             </w:rPr>
             <w:drawing>
               <wp:inline distT="0" distB="0" distL="0" distR="0" wp14:anchorId="151A8098" wp14:editId="34C3FA3F">
-                <wp:extent cx="723900" cy="631163"/>
+                <wp:extent cx="1100000" cy="959081"/>
                 <wp:effectExtent l="0" t="0" r="0" b="0"/>
                 <wp:docPr id="38064677" name="Picture 2"/>
                 <wp:cNvGraphicFramePr>
@@ -2447,7 +2447,7 @@
                       <pic:spPr bwMode="auto">
                         <a:xfrm>
                           <a:off x="0" y="0"/>
-                          <a:ext cx="750578" cy="654423"/>
+                          <a:ext cx="1140538" cy="994426"/>
                         </a:xfrm>
                         <a:prstGeom prst="rect">
                           <a:avLst/>

</xml_diff>

<commit_message>
Toplantı Tutanağı Word şablonu: boş 2. sayfa/3 sayfa sorunu giderildi (sayfa kırma paragrafı)
Co-Authored-By: Claude Sonnet 5.5 <noreply@anthropic.com>
Claude-Session: https://claude.ai/code/session_01J6foNXTwf1dGzDjULYpfrk
</commit_message>
<xml_diff>
--- a/formlar/15. İç Denetim ve Yönetim Gözden Geçirme/EMS.YS.FRM.11.07. Toplantı Tutanağı Formu.docx
+++ b/formlar/15. İç Denetim ve Yönetim Gözden Geçirme/EMS.YS.FRM.11.07. Toplantı Tutanağı Formu.docx
@@ -698,7 +698,7 @@
       </w:tr>
       <w:tr>
         <w:trPr>
-          <w:trHeight w:val="370" w:hRule="atLeast"/>
+          <w:trHeight w:val="340" w:hRule="atLeast"/>
           <w:cantSplit/>
         </w:trPr>
         <w:tc>
@@ -871,7 +871,7 @@
       </w:tr>
       <w:tr>
         <w:trPr>
-          <w:trHeight w:val="370" w:hRule="atLeast"/>
+          <w:trHeight w:val="340" w:hRule="atLeast"/>
           <w:cantSplit/>
         </w:trPr>
         <w:tc>
@@ -1044,7 +1044,7 @@
       </w:tr>
       <w:tr>
         <w:trPr>
-          <w:trHeight w:val="370" w:hRule="atLeast"/>
+          <w:trHeight w:val="340" w:hRule="atLeast"/>
           <w:cantSplit/>
         </w:trPr>
         <w:tc>
@@ -1217,7 +1217,7 @@
       </w:tr>
       <w:tr>
         <w:trPr>
-          <w:trHeight w:val="370" w:hRule="atLeast"/>
+          <w:trHeight w:val="340" w:hRule="atLeast"/>
           <w:cantSplit/>
         </w:trPr>
         <w:tc>
@@ -1390,7 +1390,7 @@
       </w:tr>
       <w:tr>
         <w:trPr>
-          <w:trHeight w:val="370" w:hRule="atLeast"/>
+          <w:trHeight w:val="340" w:hRule="atLeast"/>
           <w:cantSplit/>
         </w:trPr>
         <w:tc>
@@ -1563,7 +1563,7 @@
       </w:tr>
       <w:tr>
         <w:trPr>
-          <w:trHeight w:val="370" w:hRule="atLeast"/>
+          <w:trHeight w:val="340" w:hRule="atLeast"/>
           <w:cantSplit/>
         </w:trPr>
         <w:tc>
@@ -1736,7 +1736,7 @@
       </w:tr>
       <w:tr>
         <w:trPr>
-          <w:trHeight w:val="370" w:hRule="atLeast"/>
+          <w:trHeight w:val="340" w:hRule="atLeast"/>
           <w:cantSplit/>
         </w:trPr>
         <w:tc>
@@ -1909,7 +1909,7 @@
       </w:tr>
       <w:tr>
         <w:trPr>
-          <w:trHeight w:val="370" w:hRule="atLeast"/>
+          <w:trHeight w:val="340" w:hRule="atLeast"/>
           <w:cantSplit/>
         </w:trPr>
         <w:tc>
@@ -2082,7 +2082,7 @@
       </w:tr>
       <w:tr>
         <w:trPr>
-          <w:trHeight w:val="370" w:hRule="atLeast"/>
+          <w:trHeight w:val="340" w:hRule="atLeast"/>
           <w:cantSplit/>
         </w:trPr>
         <w:tc>
@@ -2255,7 +2255,7 @@
       </w:tr>
       <w:tr>
         <w:trPr>
-          <w:trHeight w:val="370" w:hRule="atLeast"/>
+          <w:trHeight w:val="340" w:hRule="atLeast"/>
           <w:cantSplit/>
         </w:trPr>
         <w:tc>
@@ -3154,14 +3154,9 @@
     </w:tbl>
     <w:p>
       <w:pPr>
+        <w:pageBreakBefore/>
         <w:spacing w:line="30" w:lineRule="exact" w:before="0" w:after="0"/>
       </w:pPr>
-      <w:r>
-        <w:rPr>
-          <w:sz w:val="2"/>
-        </w:rPr>
-        <w:br w:type="page"/>
-      </w:r>
     </w:p>
     <w:tbl>
       <w:tblPr>
@@ -5037,6 +5032,11 @@
         </w:tc>
       </w:tr>
     </w:tbl>
+    <w:p>
+      <w:pPr>
+        <w:spacing w:line="30" w:lineRule="exact" w:before="0" w:after="0"/>
+      </w:pPr>
+    </w:p>
     <w:sectPr>
       <w:headerReference w:type="even" r:id="rId10"/>
       <w:headerReference w:type="default" r:id="rId11"/>

</xml_diff>

<commit_message>
Toplantı Tutanağı Word şablonu: boş 2. sayfa/3 sayfa sorunu giderildi (sayfa kırma paragrafı) (#485)
Claude-Session: https://claude.ai/code/session_01J6foNXTwf1dGzDjULYpfrk

Co-authored-by: Claude <noreply@anthropic.com>
</commit_message>
<xml_diff>
--- a/formlar/15. İç Denetim ve Yönetim Gözden Geçirme/EMS.YS.FRM.11.07. Toplantı Tutanağı Formu.docx
+++ b/formlar/15. İç Denetim ve Yönetim Gözden Geçirme/EMS.YS.FRM.11.07. Toplantı Tutanağı Formu.docx
@@ -698,7 +698,7 @@
       </w:tr>
       <w:tr>
         <w:trPr>
-          <w:trHeight w:val="370" w:hRule="atLeast"/>
+          <w:trHeight w:val="340" w:hRule="atLeast"/>
           <w:cantSplit/>
         </w:trPr>
         <w:tc>
@@ -871,7 +871,7 @@
       </w:tr>
       <w:tr>
         <w:trPr>
-          <w:trHeight w:val="370" w:hRule="atLeast"/>
+          <w:trHeight w:val="340" w:hRule="atLeast"/>
           <w:cantSplit/>
         </w:trPr>
         <w:tc>
@@ -1044,7 +1044,7 @@
       </w:tr>
       <w:tr>
         <w:trPr>
-          <w:trHeight w:val="370" w:hRule="atLeast"/>
+          <w:trHeight w:val="340" w:hRule="atLeast"/>
           <w:cantSplit/>
         </w:trPr>
         <w:tc>
@@ -1217,7 +1217,7 @@
       </w:tr>
       <w:tr>
         <w:trPr>
-          <w:trHeight w:val="370" w:hRule="atLeast"/>
+          <w:trHeight w:val="340" w:hRule="atLeast"/>
           <w:cantSplit/>
         </w:trPr>
         <w:tc>
@@ -1390,7 +1390,7 @@
       </w:tr>
       <w:tr>
         <w:trPr>
-          <w:trHeight w:val="370" w:hRule="atLeast"/>
+          <w:trHeight w:val="340" w:hRule="atLeast"/>
           <w:cantSplit/>
         </w:trPr>
         <w:tc>
@@ -1563,7 +1563,7 @@
       </w:tr>
       <w:tr>
         <w:trPr>
-          <w:trHeight w:val="370" w:hRule="atLeast"/>
+          <w:trHeight w:val="340" w:hRule="atLeast"/>
           <w:cantSplit/>
         </w:trPr>
         <w:tc>
@@ -1736,7 +1736,7 @@
       </w:tr>
       <w:tr>
         <w:trPr>
-          <w:trHeight w:val="370" w:hRule="atLeast"/>
+          <w:trHeight w:val="340" w:hRule="atLeast"/>
           <w:cantSplit/>
         </w:trPr>
         <w:tc>
@@ -1909,7 +1909,7 @@
       </w:tr>
       <w:tr>
         <w:trPr>
-          <w:trHeight w:val="370" w:hRule="atLeast"/>
+          <w:trHeight w:val="340" w:hRule="atLeast"/>
           <w:cantSplit/>
         </w:trPr>
         <w:tc>
@@ -2082,7 +2082,7 @@
       </w:tr>
       <w:tr>
         <w:trPr>
-          <w:trHeight w:val="370" w:hRule="atLeast"/>
+          <w:trHeight w:val="340" w:hRule="atLeast"/>
           <w:cantSplit/>
         </w:trPr>
         <w:tc>
@@ -2255,7 +2255,7 @@
       </w:tr>
       <w:tr>
         <w:trPr>
-          <w:trHeight w:val="370" w:hRule="atLeast"/>
+          <w:trHeight w:val="340" w:hRule="atLeast"/>
           <w:cantSplit/>
         </w:trPr>
         <w:tc>
@@ -3154,14 +3154,9 @@
     </w:tbl>
     <w:p>
       <w:pPr>
+        <w:pageBreakBefore/>
         <w:spacing w:line="30" w:lineRule="exact" w:before="0" w:after="0"/>
       </w:pPr>
-      <w:r>
-        <w:rPr>
-          <w:sz w:val="2"/>
-        </w:rPr>
-        <w:br w:type="page"/>
-      </w:r>
     </w:p>
     <w:tbl>
       <w:tblPr>
@@ -5037,6 +5032,11 @@
         </w:tc>
       </w:tr>
     </w:tbl>
+    <w:p>
+      <w:pPr>
+        <w:spacing w:line="30" w:lineRule="exact" w:before="0" w:after="0"/>
+      </w:pPr>
+    </w:p>
     <w:sectPr>
       <w:headerReference w:type="even" r:id="rId10"/>
       <w:headerReference w:type="default" r:id="rId11"/>

</xml_diff>

<commit_message>
Toplantı Tutanağı Word şablonu: tek konu tablosu, boş sayfa yapan ayrı sayfa kırma kaldırıldı
Co-Authored-By: Claude Sonnet 5.5 <noreply@anthropic.com>
Claude-Session: https://claude.ai/code/session_01J6foNXTwf1dGzDjULYpfrk
</commit_message>
<xml_diff>
--- a/formlar/15. İç Denetim ve Yönetim Gözden Geçirme/EMS.YS.FRM.11.07. Toplantı Tutanağı Formu.docx
+++ b/formlar/15. İç Denetim ve Yönetim Gözden Geçirme/EMS.YS.FRM.11.07. Toplantı Tutanağı Formu.docx
@@ -2634,7 +2634,7 @@
           </w:tcPr>
           <w:p>
             <w:pPr>
-              <w:keepNext/>
+              <w:pageBreakBefore w:val="0"/>
               <w:spacing w:before="0" w:after="0"/>
             </w:pPr>
             <w:r>
@@ -3151,181 +3151,532 @@
           </w:p>
         </w:tc>
       </w:tr>
-    </w:tbl>
-    <w:p>
-      <w:pPr>
-        <w:pageBreakBefore/>
-        <w:spacing w:line="30" w:lineRule="exact" w:before="0" w:after="0"/>
-      </w:pPr>
-    </w:p>
-    <w:tbl>
-      <w:tblPr>
-        <w:tblW w:type="dxa" w:w="15700"/>
-        <w:tblLook w:firstColumn="1" w:firstRow="1" w:lastColumn="0" w:lastRow="0" w:noHBand="0" w:noVBand="1" w:val="04A0"/>
-        <w:tblBorders>
-          <w:top w:val="single" w:sz="4" w:space="0" w:color="000000"/>
-          <w:left w:val="single" w:sz="4" w:space="0" w:color="000000"/>
-          <w:bottom w:val="single" w:sz="4" w:space="0" w:color="000000"/>
-          <w:right w:val="single" w:sz="4" w:space="0" w:color="000000"/>
-          <w:insideH w:val="single" w:sz="4" w:space="0" w:color="000000"/>
-          <w:insideV w:val="single" w:sz="4" w:space="0" w:color="000000"/>
-        </w:tblBorders>
-        <w:tblLayout w:type="fixed"/>
-        <w:tblCellMar>
-          <w:top w:w="12" w:type="dxa"/>
-          <w:left w:w="70" w:type="dxa"/>
-          <w:bottom w:w="12" w:type="dxa"/>
-          <w:right w:w="70" w:type="dxa"/>
-        </w:tblCellMar>
-      </w:tblPr>
-      <w:tblGrid>
-        <w:gridCol w:w="7000"/>
-        <w:gridCol w:w="4300"/>
-        <w:gridCol w:w="2400"/>
-        <w:gridCol w:w="2000"/>
-      </w:tblGrid>
       <w:tr>
         <w:trPr>
-          <w:trHeight w:val="330" w:hRule="atLeast"/>
-          <w:tblHeader/>
+          <w:trHeight w:val="290" w:hRule="atLeast"/>
+          <w:cantSplit/>
         </w:trPr>
         <w:tc>
           <w:tcPr>
+            <w:tcW w:type="dxa" w:w="15700"/>
+            <w:gridSpan w:val="4"/>
+            <w:shd w:val="clear" w:color="auto" w:fill="D9D9D9"/>
+          </w:tcPr>
+          <w:p>
+            <w:pPr>
+              <w:pageBreakBefore/>
+              <w:spacing w:before="0" w:after="0"/>
+            </w:pPr>
+            <w:r>
+              <w:rPr>
+                <w:rFonts w:ascii="Calibri" w:hAnsi="Calibri" w:cs="Arial"/>
+                <w:b/>
+                <w:sz w:val="18"/>
+                <w:szCs w:val="18"/>
+              </w:rPr>
+              <w:t>2. ÖRGÜ &amp; BOYA</w:t>
+            </w:r>
+            <w:r>
+              <w:rPr>
+                <w:rFonts w:ascii="Calibri" w:hAnsi="Calibri" w:cs="Arial"/>
+                <w:b w:val="0"/>
+                <w:color w:val="555555"/>
+                <w:sz w:val="15"/>
+                <w:szCs w:val="15"/>
+              </w:rPr>
+              <w:t xml:space="preserve">  Knitting &amp; Dyeing</w:t>
+            </w:r>
+          </w:p>
+        </w:tc>
+      </w:tr>
+      <w:tr>
+        <w:trPr>
+          <w:trHeight w:val="295" w:hRule="atLeast"/>
+          <w:cantSplit/>
+        </w:trPr>
+        <w:tc>
+          <w:tcPr>
             <w:tcW w:type="dxa" w:w="7000"/>
-            <w:shd w:val="clear" w:color="auto" w:fill="F2F2F2"/>
-          </w:tcPr>
-          <w:p>
-            <w:pPr>
-              <w:spacing w:before="0" w:after="0"/>
-            </w:pPr>
-            <w:r>
-              <w:rPr>
-                <w:rFonts w:ascii="Calibri" w:hAnsi="Calibri" w:cs="Arial"/>
-                <w:b/>
-                <w:sz w:val="17"/>
-                <w:szCs w:val="17"/>
-              </w:rPr>
-              <w:t>Görüşülen Konu ve Alınan Karar</w:t>
-            </w:r>
-          </w:p>
-          <w:p>
-            <w:pPr>
-              <w:spacing w:before="0" w:after="0"/>
-            </w:pPr>
-            <w:r>
-              <w:rPr>
-                <w:rFonts w:ascii="Calibri" w:hAnsi="Calibri" w:cs="Arial"/>
-                <w:b w:val="0"/>
-                <w:color w:val="555555"/>
-                <w:sz w:val="12"/>
-                <w:szCs w:val="12"/>
-              </w:rPr>
-              <w:t>Topic Discussed and Decision Taken</w:t>
+          </w:tcPr>
+          <w:p>
+            <w:pPr>
+              <w:spacing w:before="0" w:after="0"/>
+            </w:pPr>
+            <w:r>
+              <w:rPr>
+                <w:rFonts w:ascii="Calibri" w:hAnsi="Calibri" w:cs="Arial"/>
+                <w:b w:val="0"/>
+                <w:sz w:val="17"/>
+                <w:szCs w:val="17"/>
+              </w:rPr>
+              <w:t xml:space="preserve"> </w:t>
             </w:r>
           </w:p>
         </w:tc>
         <w:tc>
           <w:tcPr>
             <w:tcW w:type="dxa" w:w="4300"/>
-            <w:shd w:val="clear" w:color="auto" w:fill="F2F2F2"/>
-          </w:tcPr>
-          <w:p>
-            <w:pPr>
-              <w:spacing w:before="0" w:after="0"/>
-            </w:pPr>
-            <w:r>
-              <w:rPr>
-                <w:rFonts w:ascii="Calibri" w:hAnsi="Calibri" w:cs="Arial"/>
-                <w:b/>
-                <w:sz w:val="17"/>
-                <w:szCs w:val="17"/>
-              </w:rPr>
-              <w:t>Aksiyon</w:t>
-            </w:r>
-          </w:p>
-          <w:p>
-            <w:pPr>
-              <w:spacing w:before="0" w:after="0"/>
-            </w:pPr>
-            <w:r>
-              <w:rPr>
-                <w:rFonts w:ascii="Calibri" w:hAnsi="Calibri" w:cs="Arial"/>
-                <w:b w:val="0"/>
-                <w:color w:val="555555"/>
-                <w:sz w:val="12"/>
-                <w:szCs w:val="12"/>
-              </w:rPr>
-              <w:t>Action</w:t>
+          </w:tcPr>
+          <w:p>
+            <w:pPr>
+              <w:spacing w:before="0" w:after="0"/>
+            </w:pPr>
+            <w:r>
+              <w:rPr>
+                <w:rFonts w:ascii="Calibri" w:hAnsi="Calibri" w:cs="Arial"/>
+                <w:b w:val="0"/>
+                <w:sz w:val="17"/>
+                <w:szCs w:val="17"/>
+              </w:rPr>
+              <w:t xml:space="preserve"> </w:t>
             </w:r>
           </w:p>
         </w:tc>
         <w:tc>
           <w:tcPr>
             <w:tcW w:type="dxa" w:w="2400"/>
-            <w:shd w:val="clear" w:color="auto" w:fill="F2F2F2"/>
-          </w:tcPr>
-          <w:p>
-            <w:pPr>
-              <w:spacing w:before="0" w:after="0"/>
-            </w:pPr>
-            <w:r>
-              <w:rPr>
-                <w:rFonts w:ascii="Calibri" w:hAnsi="Calibri" w:cs="Arial"/>
-                <w:b/>
-                <w:sz w:val="17"/>
-                <w:szCs w:val="17"/>
-              </w:rPr>
-              <w:t>Sorumlu</w:t>
-            </w:r>
-          </w:p>
-          <w:p>
-            <w:pPr>
-              <w:spacing w:before="0" w:after="0"/>
-            </w:pPr>
-            <w:r>
-              <w:rPr>
-                <w:rFonts w:ascii="Calibri" w:hAnsi="Calibri" w:cs="Arial"/>
-                <w:b w:val="0"/>
-                <w:color w:val="555555"/>
-                <w:sz w:val="12"/>
-                <w:szCs w:val="12"/>
-              </w:rPr>
-              <w:t>Owner</w:t>
+          </w:tcPr>
+          <w:p>
+            <w:pPr>
+              <w:spacing w:before="0" w:after="0"/>
+            </w:pPr>
+            <w:r>
+              <w:rPr>
+                <w:rFonts w:ascii="Calibri" w:hAnsi="Calibri" w:cs="Arial"/>
+                <w:b w:val="0"/>
+                <w:sz w:val="17"/>
+                <w:szCs w:val="17"/>
+              </w:rPr>
+              <w:t xml:space="preserve"> </w:t>
             </w:r>
           </w:p>
         </w:tc>
         <w:tc>
           <w:tcPr>
             <w:tcW w:type="dxa" w:w="2000"/>
-            <w:shd w:val="clear" w:color="auto" w:fill="F2F2F2"/>
-          </w:tcPr>
-          <w:p>
-            <w:pPr>
-              <w:spacing w:before="0" w:after="0"/>
-            </w:pPr>
-            <w:r>
-              <w:rPr>
-                <w:rFonts w:ascii="Calibri" w:hAnsi="Calibri" w:cs="Arial"/>
-                <w:b/>
-                <w:sz w:val="17"/>
-                <w:szCs w:val="17"/>
-              </w:rPr>
-              <w:t>Termin</w:t>
-            </w:r>
-          </w:p>
-          <w:p>
-            <w:pPr>
-              <w:spacing w:before="0" w:after="0"/>
-            </w:pPr>
-            <w:r>
-              <w:rPr>
-                <w:rFonts w:ascii="Calibri" w:hAnsi="Calibri" w:cs="Arial"/>
-                <w:b w:val="0"/>
-                <w:color w:val="555555"/>
-                <w:sz w:val="12"/>
-                <w:szCs w:val="12"/>
-              </w:rPr>
-              <w:t>Due Date</w:t>
+          </w:tcPr>
+          <w:p>
+            <w:pPr>
+              <w:spacing w:before="0" w:after="0"/>
+            </w:pPr>
+            <w:r>
+              <w:rPr>
+                <w:rFonts w:ascii="Calibri" w:hAnsi="Calibri" w:cs="Arial"/>
+                <w:b w:val="0"/>
+                <w:sz w:val="17"/>
+                <w:szCs w:val="17"/>
+              </w:rPr>
+              <w:t xml:space="preserve"> </w:t>
+            </w:r>
+          </w:p>
+        </w:tc>
+      </w:tr>
+      <w:tr>
+        <w:trPr>
+          <w:trHeight w:val="295" w:hRule="atLeast"/>
+          <w:cantSplit/>
+        </w:trPr>
+        <w:tc>
+          <w:tcPr>
+            <w:tcW w:type="dxa" w:w="7000"/>
+          </w:tcPr>
+          <w:p>
+            <w:pPr>
+              <w:spacing w:before="0" w:after="0"/>
+            </w:pPr>
+            <w:r>
+              <w:rPr>
+                <w:rFonts w:ascii="Calibri" w:hAnsi="Calibri" w:cs="Arial"/>
+                <w:b w:val="0"/>
+                <w:sz w:val="17"/>
+                <w:szCs w:val="17"/>
+              </w:rPr>
+              <w:t xml:space="preserve"> </w:t>
+            </w:r>
+          </w:p>
+        </w:tc>
+        <w:tc>
+          <w:tcPr>
+            <w:tcW w:type="dxa" w:w="4300"/>
+          </w:tcPr>
+          <w:p>
+            <w:pPr>
+              <w:spacing w:before="0" w:after="0"/>
+            </w:pPr>
+            <w:r>
+              <w:rPr>
+                <w:rFonts w:ascii="Calibri" w:hAnsi="Calibri" w:cs="Arial"/>
+                <w:b w:val="0"/>
+                <w:sz w:val="17"/>
+                <w:szCs w:val="17"/>
+              </w:rPr>
+              <w:t xml:space="preserve"> </w:t>
+            </w:r>
+          </w:p>
+        </w:tc>
+        <w:tc>
+          <w:tcPr>
+            <w:tcW w:type="dxa" w:w="2400"/>
+          </w:tcPr>
+          <w:p>
+            <w:pPr>
+              <w:spacing w:before="0" w:after="0"/>
+            </w:pPr>
+            <w:r>
+              <w:rPr>
+                <w:rFonts w:ascii="Calibri" w:hAnsi="Calibri" w:cs="Arial"/>
+                <w:b w:val="0"/>
+                <w:sz w:val="17"/>
+                <w:szCs w:val="17"/>
+              </w:rPr>
+              <w:t xml:space="preserve"> </w:t>
+            </w:r>
+          </w:p>
+        </w:tc>
+        <w:tc>
+          <w:tcPr>
+            <w:tcW w:type="dxa" w:w="2000"/>
+          </w:tcPr>
+          <w:p>
+            <w:pPr>
+              <w:spacing w:before="0" w:after="0"/>
+            </w:pPr>
+            <w:r>
+              <w:rPr>
+                <w:rFonts w:ascii="Calibri" w:hAnsi="Calibri" w:cs="Arial"/>
+                <w:b w:val="0"/>
+                <w:sz w:val="17"/>
+                <w:szCs w:val="17"/>
+              </w:rPr>
+              <w:t xml:space="preserve"> </w:t>
+            </w:r>
+          </w:p>
+        </w:tc>
+      </w:tr>
+      <w:tr>
+        <w:trPr>
+          <w:trHeight w:val="295" w:hRule="atLeast"/>
+          <w:cantSplit/>
+        </w:trPr>
+        <w:tc>
+          <w:tcPr>
+            <w:tcW w:type="dxa" w:w="7000"/>
+          </w:tcPr>
+          <w:p>
+            <w:pPr>
+              <w:spacing w:before="0" w:after="0"/>
+            </w:pPr>
+            <w:r>
+              <w:rPr>
+                <w:rFonts w:ascii="Calibri" w:hAnsi="Calibri" w:cs="Arial"/>
+                <w:b w:val="0"/>
+                <w:sz w:val="17"/>
+                <w:szCs w:val="17"/>
+              </w:rPr>
+              <w:t xml:space="preserve"> </w:t>
+            </w:r>
+          </w:p>
+        </w:tc>
+        <w:tc>
+          <w:tcPr>
+            <w:tcW w:type="dxa" w:w="4300"/>
+          </w:tcPr>
+          <w:p>
+            <w:pPr>
+              <w:spacing w:before="0" w:after="0"/>
+            </w:pPr>
+            <w:r>
+              <w:rPr>
+                <w:rFonts w:ascii="Calibri" w:hAnsi="Calibri" w:cs="Arial"/>
+                <w:b w:val="0"/>
+                <w:sz w:val="17"/>
+                <w:szCs w:val="17"/>
+              </w:rPr>
+              <w:t xml:space="preserve"> </w:t>
+            </w:r>
+          </w:p>
+        </w:tc>
+        <w:tc>
+          <w:tcPr>
+            <w:tcW w:type="dxa" w:w="2400"/>
+          </w:tcPr>
+          <w:p>
+            <w:pPr>
+              <w:spacing w:before="0" w:after="0"/>
+            </w:pPr>
+            <w:r>
+              <w:rPr>
+                <w:rFonts w:ascii="Calibri" w:hAnsi="Calibri" w:cs="Arial"/>
+                <w:b w:val="0"/>
+                <w:sz w:val="17"/>
+                <w:szCs w:val="17"/>
+              </w:rPr>
+              <w:t xml:space="preserve"> </w:t>
+            </w:r>
+          </w:p>
+        </w:tc>
+        <w:tc>
+          <w:tcPr>
+            <w:tcW w:type="dxa" w:w="2000"/>
+          </w:tcPr>
+          <w:p>
+            <w:pPr>
+              <w:spacing w:before="0" w:after="0"/>
+            </w:pPr>
+            <w:r>
+              <w:rPr>
+                <w:rFonts w:ascii="Calibri" w:hAnsi="Calibri" w:cs="Arial"/>
+                <w:b w:val="0"/>
+                <w:sz w:val="17"/>
+                <w:szCs w:val="17"/>
+              </w:rPr>
+              <w:t xml:space="preserve"> </w:t>
+            </w:r>
+          </w:p>
+        </w:tc>
+      </w:tr>
+      <w:tr>
+        <w:trPr>
+          <w:trHeight w:val="295" w:hRule="atLeast"/>
+          <w:cantSplit/>
+        </w:trPr>
+        <w:tc>
+          <w:tcPr>
+            <w:tcW w:type="dxa" w:w="7000"/>
+          </w:tcPr>
+          <w:p>
+            <w:pPr>
+              <w:spacing w:before="0" w:after="0"/>
+            </w:pPr>
+            <w:r>
+              <w:rPr>
+                <w:rFonts w:ascii="Calibri" w:hAnsi="Calibri" w:cs="Arial"/>
+                <w:b w:val="0"/>
+                <w:sz w:val="17"/>
+                <w:szCs w:val="17"/>
+              </w:rPr>
+              <w:t xml:space="preserve"> </w:t>
+            </w:r>
+          </w:p>
+        </w:tc>
+        <w:tc>
+          <w:tcPr>
+            <w:tcW w:type="dxa" w:w="4300"/>
+          </w:tcPr>
+          <w:p>
+            <w:pPr>
+              <w:spacing w:before="0" w:after="0"/>
+            </w:pPr>
+            <w:r>
+              <w:rPr>
+                <w:rFonts w:ascii="Calibri" w:hAnsi="Calibri" w:cs="Arial"/>
+                <w:b w:val="0"/>
+                <w:sz w:val="17"/>
+                <w:szCs w:val="17"/>
+              </w:rPr>
+              <w:t xml:space="preserve"> </w:t>
+            </w:r>
+          </w:p>
+        </w:tc>
+        <w:tc>
+          <w:tcPr>
+            <w:tcW w:type="dxa" w:w="2400"/>
+          </w:tcPr>
+          <w:p>
+            <w:pPr>
+              <w:spacing w:before="0" w:after="0"/>
+            </w:pPr>
+            <w:r>
+              <w:rPr>
+                <w:rFonts w:ascii="Calibri" w:hAnsi="Calibri" w:cs="Arial"/>
+                <w:b w:val="0"/>
+                <w:sz w:val="17"/>
+                <w:szCs w:val="17"/>
+              </w:rPr>
+              <w:t xml:space="preserve"> </w:t>
+            </w:r>
+          </w:p>
+        </w:tc>
+        <w:tc>
+          <w:tcPr>
+            <w:tcW w:type="dxa" w:w="2000"/>
+          </w:tcPr>
+          <w:p>
+            <w:pPr>
+              <w:spacing w:before="0" w:after="0"/>
+            </w:pPr>
+            <w:r>
+              <w:rPr>
+                <w:rFonts w:ascii="Calibri" w:hAnsi="Calibri" w:cs="Arial"/>
+                <w:b w:val="0"/>
+                <w:sz w:val="17"/>
+                <w:szCs w:val="17"/>
+              </w:rPr>
+              <w:t xml:space="preserve"> </w:t>
+            </w:r>
+          </w:p>
+        </w:tc>
+      </w:tr>
+      <w:tr>
+        <w:trPr>
+          <w:trHeight w:val="295" w:hRule="atLeast"/>
+          <w:cantSplit/>
+        </w:trPr>
+        <w:tc>
+          <w:tcPr>
+            <w:tcW w:type="dxa" w:w="7000"/>
+          </w:tcPr>
+          <w:p>
+            <w:pPr>
+              <w:spacing w:before="0" w:after="0"/>
+            </w:pPr>
+            <w:r>
+              <w:rPr>
+                <w:rFonts w:ascii="Calibri" w:hAnsi="Calibri" w:cs="Arial"/>
+                <w:b w:val="0"/>
+                <w:sz w:val="17"/>
+                <w:szCs w:val="17"/>
+              </w:rPr>
+              <w:t xml:space="preserve"> </w:t>
+            </w:r>
+          </w:p>
+        </w:tc>
+        <w:tc>
+          <w:tcPr>
+            <w:tcW w:type="dxa" w:w="4300"/>
+          </w:tcPr>
+          <w:p>
+            <w:pPr>
+              <w:spacing w:before="0" w:after="0"/>
+            </w:pPr>
+            <w:r>
+              <w:rPr>
+                <w:rFonts w:ascii="Calibri" w:hAnsi="Calibri" w:cs="Arial"/>
+                <w:b w:val="0"/>
+                <w:sz w:val="17"/>
+                <w:szCs w:val="17"/>
+              </w:rPr>
+              <w:t xml:space="preserve"> </w:t>
+            </w:r>
+          </w:p>
+        </w:tc>
+        <w:tc>
+          <w:tcPr>
+            <w:tcW w:type="dxa" w:w="2400"/>
+          </w:tcPr>
+          <w:p>
+            <w:pPr>
+              <w:spacing w:before="0" w:after="0"/>
+            </w:pPr>
+            <w:r>
+              <w:rPr>
+                <w:rFonts w:ascii="Calibri" w:hAnsi="Calibri" w:cs="Arial"/>
+                <w:b w:val="0"/>
+                <w:sz w:val="17"/>
+                <w:szCs w:val="17"/>
+              </w:rPr>
+              <w:t xml:space="preserve"> </w:t>
+            </w:r>
+          </w:p>
+        </w:tc>
+        <w:tc>
+          <w:tcPr>
+            <w:tcW w:type="dxa" w:w="2000"/>
+          </w:tcPr>
+          <w:p>
+            <w:pPr>
+              <w:spacing w:before="0" w:after="0"/>
+            </w:pPr>
+            <w:r>
+              <w:rPr>
+                <w:rFonts w:ascii="Calibri" w:hAnsi="Calibri" w:cs="Arial"/>
+                <w:b w:val="0"/>
+                <w:sz w:val="17"/>
+                <w:szCs w:val="17"/>
+              </w:rPr>
+              <w:t xml:space="preserve"> </w:t>
+            </w:r>
+          </w:p>
+        </w:tc>
+      </w:tr>
+      <w:tr>
+        <w:trPr>
+          <w:trHeight w:val="295" w:hRule="atLeast"/>
+          <w:cantSplit/>
+        </w:trPr>
+        <w:tc>
+          <w:tcPr>
+            <w:tcW w:type="dxa" w:w="7000"/>
+          </w:tcPr>
+          <w:p>
+            <w:pPr>
+              <w:spacing w:before="0" w:after="0"/>
+            </w:pPr>
+            <w:r>
+              <w:rPr>
+                <w:rFonts w:ascii="Calibri" w:hAnsi="Calibri" w:cs="Arial"/>
+                <w:b w:val="0"/>
+                <w:sz w:val="17"/>
+                <w:szCs w:val="17"/>
+              </w:rPr>
+              <w:t xml:space="preserve"> </w:t>
+            </w:r>
+          </w:p>
+        </w:tc>
+        <w:tc>
+          <w:tcPr>
+            <w:tcW w:type="dxa" w:w="4300"/>
+          </w:tcPr>
+          <w:p>
+            <w:pPr>
+              <w:spacing w:before="0" w:after="0"/>
+            </w:pPr>
+            <w:r>
+              <w:rPr>
+                <w:rFonts w:ascii="Calibri" w:hAnsi="Calibri" w:cs="Arial"/>
+                <w:b w:val="0"/>
+                <w:sz w:val="17"/>
+                <w:szCs w:val="17"/>
+              </w:rPr>
+              <w:t xml:space="preserve"> </w:t>
+            </w:r>
+          </w:p>
+        </w:tc>
+        <w:tc>
+          <w:tcPr>
+            <w:tcW w:type="dxa" w:w="2400"/>
+          </w:tcPr>
+          <w:p>
+            <w:pPr>
+              <w:spacing w:before="0" w:after="0"/>
+            </w:pPr>
+            <w:r>
+              <w:rPr>
+                <w:rFonts w:ascii="Calibri" w:hAnsi="Calibri" w:cs="Arial"/>
+                <w:b w:val="0"/>
+                <w:sz w:val="17"/>
+                <w:szCs w:val="17"/>
+              </w:rPr>
+              <w:t xml:space="preserve"> </w:t>
+            </w:r>
+          </w:p>
+        </w:tc>
+        <w:tc>
+          <w:tcPr>
+            <w:tcW w:type="dxa" w:w="2000"/>
+          </w:tcPr>
+          <w:p>
+            <w:pPr>
+              <w:spacing w:before="0" w:after="0"/>
+            </w:pPr>
+            <w:r>
+              <w:rPr>
+                <w:rFonts w:ascii="Calibri" w:hAnsi="Calibri" w:cs="Arial"/>
+                <w:b w:val="0"/>
+                <w:sz w:val="17"/>
+                <w:szCs w:val="17"/>
+              </w:rPr>
+              <w:t xml:space="preserve"> </w:t>
             </w:r>
           </w:p>
         </w:tc>
@@ -3343,7 +3694,7 @@
           </w:tcPr>
           <w:p>
             <w:pPr>
-              <w:keepNext/>
+              <w:pageBreakBefore w:val="0"/>
               <w:spacing w:before="0" w:after="0"/>
             </w:pPr>
             <w:r>
@@ -3353,7 +3704,7 @@
                 <w:sz w:val="18"/>
                 <w:szCs w:val="18"/>
               </w:rPr>
-              <w:t>2. ÖRGÜ &amp; BOYA</w:t>
+              <w:t>3. MAKİNE &amp; ENERJİ</w:t>
             </w:r>
             <w:r>
               <w:rPr>
@@ -3363,7 +3714,7 @@
                 <w:sz w:val="15"/>
                 <w:szCs w:val="15"/>
               </w:rPr>
-              <w:t xml:space="preserve">  Knitting &amp; Dyeing</w:t>
+              <w:t xml:space="preserve">  Machinery &amp; Energy</w:t>
             </w:r>
           </w:p>
         </w:tc>
@@ -3873,537 +4224,7 @@
           </w:tcPr>
           <w:p>
             <w:pPr>
-              <w:keepNext/>
-              <w:spacing w:before="0" w:after="0"/>
-            </w:pPr>
-            <w:r>
-              <w:rPr>
-                <w:rFonts w:ascii="Calibri" w:hAnsi="Calibri" w:cs="Arial"/>
-                <w:b/>
-                <w:sz w:val="18"/>
-                <w:szCs w:val="18"/>
-              </w:rPr>
-              <w:t>3. MAKİNE &amp; ENERJİ</w:t>
-            </w:r>
-            <w:r>
-              <w:rPr>
-                <w:rFonts w:ascii="Calibri" w:hAnsi="Calibri" w:cs="Arial"/>
-                <w:b w:val="0"/>
-                <w:color w:val="555555"/>
-                <w:sz w:val="15"/>
-                <w:szCs w:val="15"/>
-              </w:rPr>
-              <w:t xml:space="preserve">  Machinery &amp; Energy</w:t>
-            </w:r>
-          </w:p>
-        </w:tc>
-      </w:tr>
-      <w:tr>
-        <w:trPr>
-          <w:trHeight w:val="295" w:hRule="atLeast"/>
-          <w:cantSplit/>
-        </w:trPr>
-        <w:tc>
-          <w:tcPr>
-            <w:tcW w:type="dxa" w:w="7000"/>
-          </w:tcPr>
-          <w:p>
-            <w:pPr>
-              <w:spacing w:before="0" w:after="0"/>
-            </w:pPr>
-            <w:r>
-              <w:rPr>
-                <w:rFonts w:ascii="Calibri" w:hAnsi="Calibri" w:cs="Arial"/>
-                <w:b w:val="0"/>
-                <w:sz w:val="17"/>
-                <w:szCs w:val="17"/>
-              </w:rPr>
-              <w:t xml:space="preserve"> </w:t>
-            </w:r>
-          </w:p>
-        </w:tc>
-        <w:tc>
-          <w:tcPr>
-            <w:tcW w:type="dxa" w:w="4300"/>
-          </w:tcPr>
-          <w:p>
-            <w:pPr>
-              <w:spacing w:before="0" w:after="0"/>
-            </w:pPr>
-            <w:r>
-              <w:rPr>
-                <w:rFonts w:ascii="Calibri" w:hAnsi="Calibri" w:cs="Arial"/>
-                <w:b w:val="0"/>
-                <w:sz w:val="17"/>
-                <w:szCs w:val="17"/>
-              </w:rPr>
-              <w:t xml:space="preserve"> </w:t>
-            </w:r>
-          </w:p>
-        </w:tc>
-        <w:tc>
-          <w:tcPr>
-            <w:tcW w:type="dxa" w:w="2400"/>
-          </w:tcPr>
-          <w:p>
-            <w:pPr>
-              <w:spacing w:before="0" w:after="0"/>
-            </w:pPr>
-            <w:r>
-              <w:rPr>
-                <w:rFonts w:ascii="Calibri" w:hAnsi="Calibri" w:cs="Arial"/>
-                <w:b w:val="0"/>
-                <w:sz w:val="17"/>
-                <w:szCs w:val="17"/>
-              </w:rPr>
-              <w:t xml:space="preserve"> </w:t>
-            </w:r>
-          </w:p>
-        </w:tc>
-        <w:tc>
-          <w:tcPr>
-            <w:tcW w:type="dxa" w:w="2000"/>
-          </w:tcPr>
-          <w:p>
-            <w:pPr>
-              <w:spacing w:before="0" w:after="0"/>
-            </w:pPr>
-            <w:r>
-              <w:rPr>
-                <w:rFonts w:ascii="Calibri" w:hAnsi="Calibri" w:cs="Arial"/>
-                <w:b w:val="0"/>
-                <w:sz w:val="17"/>
-                <w:szCs w:val="17"/>
-              </w:rPr>
-              <w:t xml:space="preserve"> </w:t>
-            </w:r>
-          </w:p>
-        </w:tc>
-      </w:tr>
-      <w:tr>
-        <w:trPr>
-          <w:trHeight w:val="295" w:hRule="atLeast"/>
-          <w:cantSplit/>
-        </w:trPr>
-        <w:tc>
-          <w:tcPr>
-            <w:tcW w:type="dxa" w:w="7000"/>
-          </w:tcPr>
-          <w:p>
-            <w:pPr>
-              <w:spacing w:before="0" w:after="0"/>
-            </w:pPr>
-            <w:r>
-              <w:rPr>
-                <w:rFonts w:ascii="Calibri" w:hAnsi="Calibri" w:cs="Arial"/>
-                <w:b w:val="0"/>
-                <w:sz w:val="17"/>
-                <w:szCs w:val="17"/>
-              </w:rPr>
-              <w:t xml:space="preserve"> </w:t>
-            </w:r>
-          </w:p>
-        </w:tc>
-        <w:tc>
-          <w:tcPr>
-            <w:tcW w:type="dxa" w:w="4300"/>
-          </w:tcPr>
-          <w:p>
-            <w:pPr>
-              <w:spacing w:before="0" w:after="0"/>
-            </w:pPr>
-            <w:r>
-              <w:rPr>
-                <w:rFonts w:ascii="Calibri" w:hAnsi="Calibri" w:cs="Arial"/>
-                <w:b w:val="0"/>
-                <w:sz w:val="17"/>
-                <w:szCs w:val="17"/>
-              </w:rPr>
-              <w:t xml:space="preserve"> </w:t>
-            </w:r>
-          </w:p>
-        </w:tc>
-        <w:tc>
-          <w:tcPr>
-            <w:tcW w:type="dxa" w:w="2400"/>
-          </w:tcPr>
-          <w:p>
-            <w:pPr>
-              <w:spacing w:before="0" w:after="0"/>
-            </w:pPr>
-            <w:r>
-              <w:rPr>
-                <w:rFonts w:ascii="Calibri" w:hAnsi="Calibri" w:cs="Arial"/>
-                <w:b w:val="0"/>
-                <w:sz w:val="17"/>
-                <w:szCs w:val="17"/>
-              </w:rPr>
-              <w:t xml:space="preserve"> </w:t>
-            </w:r>
-          </w:p>
-        </w:tc>
-        <w:tc>
-          <w:tcPr>
-            <w:tcW w:type="dxa" w:w="2000"/>
-          </w:tcPr>
-          <w:p>
-            <w:pPr>
-              <w:spacing w:before="0" w:after="0"/>
-            </w:pPr>
-            <w:r>
-              <w:rPr>
-                <w:rFonts w:ascii="Calibri" w:hAnsi="Calibri" w:cs="Arial"/>
-                <w:b w:val="0"/>
-                <w:sz w:val="17"/>
-                <w:szCs w:val="17"/>
-              </w:rPr>
-              <w:t xml:space="preserve"> </w:t>
-            </w:r>
-          </w:p>
-        </w:tc>
-      </w:tr>
-      <w:tr>
-        <w:trPr>
-          <w:trHeight w:val="295" w:hRule="atLeast"/>
-          <w:cantSplit/>
-        </w:trPr>
-        <w:tc>
-          <w:tcPr>
-            <w:tcW w:type="dxa" w:w="7000"/>
-          </w:tcPr>
-          <w:p>
-            <w:pPr>
-              <w:spacing w:before="0" w:after="0"/>
-            </w:pPr>
-            <w:r>
-              <w:rPr>
-                <w:rFonts w:ascii="Calibri" w:hAnsi="Calibri" w:cs="Arial"/>
-                <w:b w:val="0"/>
-                <w:sz w:val="17"/>
-                <w:szCs w:val="17"/>
-              </w:rPr>
-              <w:t xml:space="preserve"> </w:t>
-            </w:r>
-          </w:p>
-        </w:tc>
-        <w:tc>
-          <w:tcPr>
-            <w:tcW w:type="dxa" w:w="4300"/>
-          </w:tcPr>
-          <w:p>
-            <w:pPr>
-              <w:spacing w:before="0" w:after="0"/>
-            </w:pPr>
-            <w:r>
-              <w:rPr>
-                <w:rFonts w:ascii="Calibri" w:hAnsi="Calibri" w:cs="Arial"/>
-                <w:b w:val="0"/>
-                <w:sz w:val="17"/>
-                <w:szCs w:val="17"/>
-              </w:rPr>
-              <w:t xml:space="preserve"> </w:t>
-            </w:r>
-          </w:p>
-        </w:tc>
-        <w:tc>
-          <w:tcPr>
-            <w:tcW w:type="dxa" w:w="2400"/>
-          </w:tcPr>
-          <w:p>
-            <w:pPr>
-              <w:spacing w:before="0" w:after="0"/>
-            </w:pPr>
-            <w:r>
-              <w:rPr>
-                <w:rFonts w:ascii="Calibri" w:hAnsi="Calibri" w:cs="Arial"/>
-                <w:b w:val="0"/>
-                <w:sz w:val="17"/>
-                <w:szCs w:val="17"/>
-              </w:rPr>
-              <w:t xml:space="preserve"> </w:t>
-            </w:r>
-          </w:p>
-        </w:tc>
-        <w:tc>
-          <w:tcPr>
-            <w:tcW w:type="dxa" w:w="2000"/>
-          </w:tcPr>
-          <w:p>
-            <w:pPr>
-              <w:spacing w:before="0" w:after="0"/>
-            </w:pPr>
-            <w:r>
-              <w:rPr>
-                <w:rFonts w:ascii="Calibri" w:hAnsi="Calibri" w:cs="Arial"/>
-                <w:b w:val="0"/>
-                <w:sz w:val="17"/>
-                <w:szCs w:val="17"/>
-              </w:rPr>
-              <w:t xml:space="preserve"> </w:t>
-            </w:r>
-          </w:p>
-        </w:tc>
-      </w:tr>
-      <w:tr>
-        <w:trPr>
-          <w:trHeight w:val="295" w:hRule="atLeast"/>
-          <w:cantSplit/>
-        </w:trPr>
-        <w:tc>
-          <w:tcPr>
-            <w:tcW w:type="dxa" w:w="7000"/>
-          </w:tcPr>
-          <w:p>
-            <w:pPr>
-              <w:spacing w:before="0" w:after="0"/>
-            </w:pPr>
-            <w:r>
-              <w:rPr>
-                <w:rFonts w:ascii="Calibri" w:hAnsi="Calibri" w:cs="Arial"/>
-                <w:b w:val="0"/>
-                <w:sz w:val="17"/>
-                <w:szCs w:val="17"/>
-              </w:rPr>
-              <w:t xml:space="preserve"> </w:t>
-            </w:r>
-          </w:p>
-        </w:tc>
-        <w:tc>
-          <w:tcPr>
-            <w:tcW w:type="dxa" w:w="4300"/>
-          </w:tcPr>
-          <w:p>
-            <w:pPr>
-              <w:spacing w:before="0" w:after="0"/>
-            </w:pPr>
-            <w:r>
-              <w:rPr>
-                <w:rFonts w:ascii="Calibri" w:hAnsi="Calibri" w:cs="Arial"/>
-                <w:b w:val="0"/>
-                <w:sz w:val="17"/>
-                <w:szCs w:val="17"/>
-              </w:rPr>
-              <w:t xml:space="preserve"> </w:t>
-            </w:r>
-          </w:p>
-        </w:tc>
-        <w:tc>
-          <w:tcPr>
-            <w:tcW w:type="dxa" w:w="2400"/>
-          </w:tcPr>
-          <w:p>
-            <w:pPr>
-              <w:spacing w:before="0" w:after="0"/>
-            </w:pPr>
-            <w:r>
-              <w:rPr>
-                <w:rFonts w:ascii="Calibri" w:hAnsi="Calibri" w:cs="Arial"/>
-                <w:b w:val="0"/>
-                <w:sz w:val="17"/>
-                <w:szCs w:val="17"/>
-              </w:rPr>
-              <w:t xml:space="preserve"> </w:t>
-            </w:r>
-          </w:p>
-        </w:tc>
-        <w:tc>
-          <w:tcPr>
-            <w:tcW w:type="dxa" w:w="2000"/>
-          </w:tcPr>
-          <w:p>
-            <w:pPr>
-              <w:spacing w:before="0" w:after="0"/>
-            </w:pPr>
-            <w:r>
-              <w:rPr>
-                <w:rFonts w:ascii="Calibri" w:hAnsi="Calibri" w:cs="Arial"/>
-                <w:b w:val="0"/>
-                <w:sz w:val="17"/>
-                <w:szCs w:val="17"/>
-              </w:rPr>
-              <w:t xml:space="preserve"> </w:t>
-            </w:r>
-          </w:p>
-        </w:tc>
-      </w:tr>
-      <w:tr>
-        <w:trPr>
-          <w:trHeight w:val="295" w:hRule="atLeast"/>
-          <w:cantSplit/>
-        </w:trPr>
-        <w:tc>
-          <w:tcPr>
-            <w:tcW w:type="dxa" w:w="7000"/>
-          </w:tcPr>
-          <w:p>
-            <w:pPr>
-              <w:spacing w:before="0" w:after="0"/>
-            </w:pPr>
-            <w:r>
-              <w:rPr>
-                <w:rFonts w:ascii="Calibri" w:hAnsi="Calibri" w:cs="Arial"/>
-                <w:b w:val="0"/>
-                <w:sz w:val="17"/>
-                <w:szCs w:val="17"/>
-              </w:rPr>
-              <w:t xml:space="preserve"> </w:t>
-            </w:r>
-          </w:p>
-        </w:tc>
-        <w:tc>
-          <w:tcPr>
-            <w:tcW w:type="dxa" w:w="4300"/>
-          </w:tcPr>
-          <w:p>
-            <w:pPr>
-              <w:spacing w:before="0" w:after="0"/>
-            </w:pPr>
-            <w:r>
-              <w:rPr>
-                <w:rFonts w:ascii="Calibri" w:hAnsi="Calibri" w:cs="Arial"/>
-                <w:b w:val="0"/>
-                <w:sz w:val="17"/>
-                <w:szCs w:val="17"/>
-              </w:rPr>
-              <w:t xml:space="preserve"> </w:t>
-            </w:r>
-          </w:p>
-        </w:tc>
-        <w:tc>
-          <w:tcPr>
-            <w:tcW w:type="dxa" w:w="2400"/>
-          </w:tcPr>
-          <w:p>
-            <w:pPr>
-              <w:spacing w:before="0" w:after="0"/>
-            </w:pPr>
-            <w:r>
-              <w:rPr>
-                <w:rFonts w:ascii="Calibri" w:hAnsi="Calibri" w:cs="Arial"/>
-                <w:b w:val="0"/>
-                <w:sz w:val="17"/>
-                <w:szCs w:val="17"/>
-              </w:rPr>
-              <w:t xml:space="preserve"> </w:t>
-            </w:r>
-          </w:p>
-        </w:tc>
-        <w:tc>
-          <w:tcPr>
-            <w:tcW w:type="dxa" w:w="2000"/>
-          </w:tcPr>
-          <w:p>
-            <w:pPr>
-              <w:spacing w:before="0" w:after="0"/>
-            </w:pPr>
-            <w:r>
-              <w:rPr>
-                <w:rFonts w:ascii="Calibri" w:hAnsi="Calibri" w:cs="Arial"/>
-                <w:b w:val="0"/>
-                <w:sz w:val="17"/>
-                <w:szCs w:val="17"/>
-              </w:rPr>
-              <w:t xml:space="preserve"> </w:t>
-            </w:r>
-          </w:p>
-        </w:tc>
-      </w:tr>
-      <w:tr>
-        <w:trPr>
-          <w:trHeight w:val="295" w:hRule="atLeast"/>
-          <w:cantSplit/>
-        </w:trPr>
-        <w:tc>
-          <w:tcPr>
-            <w:tcW w:type="dxa" w:w="7000"/>
-          </w:tcPr>
-          <w:p>
-            <w:pPr>
-              <w:spacing w:before="0" w:after="0"/>
-            </w:pPr>
-            <w:r>
-              <w:rPr>
-                <w:rFonts w:ascii="Calibri" w:hAnsi="Calibri" w:cs="Arial"/>
-                <w:b w:val="0"/>
-                <w:sz w:val="17"/>
-                <w:szCs w:val="17"/>
-              </w:rPr>
-              <w:t xml:space="preserve"> </w:t>
-            </w:r>
-          </w:p>
-        </w:tc>
-        <w:tc>
-          <w:tcPr>
-            <w:tcW w:type="dxa" w:w="4300"/>
-          </w:tcPr>
-          <w:p>
-            <w:pPr>
-              <w:spacing w:before="0" w:after="0"/>
-            </w:pPr>
-            <w:r>
-              <w:rPr>
-                <w:rFonts w:ascii="Calibri" w:hAnsi="Calibri" w:cs="Arial"/>
-                <w:b w:val="0"/>
-                <w:sz w:val="17"/>
-                <w:szCs w:val="17"/>
-              </w:rPr>
-              <w:t xml:space="preserve"> </w:t>
-            </w:r>
-          </w:p>
-        </w:tc>
-        <w:tc>
-          <w:tcPr>
-            <w:tcW w:type="dxa" w:w="2400"/>
-          </w:tcPr>
-          <w:p>
-            <w:pPr>
-              <w:spacing w:before="0" w:after="0"/>
-            </w:pPr>
-            <w:r>
-              <w:rPr>
-                <w:rFonts w:ascii="Calibri" w:hAnsi="Calibri" w:cs="Arial"/>
-                <w:b w:val="0"/>
-                <w:sz w:val="17"/>
-                <w:szCs w:val="17"/>
-              </w:rPr>
-              <w:t xml:space="preserve"> </w:t>
-            </w:r>
-          </w:p>
-        </w:tc>
-        <w:tc>
-          <w:tcPr>
-            <w:tcW w:type="dxa" w:w="2000"/>
-          </w:tcPr>
-          <w:p>
-            <w:pPr>
-              <w:spacing w:before="0" w:after="0"/>
-            </w:pPr>
-            <w:r>
-              <w:rPr>
-                <w:rFonts w:ascii="Calibri" w:hAnsi="Calibri" w:cs="Arial"/>
-                <w:b w:val="0"/>
-                <w:sz w:val="17"/>
-                <w:szCs w:val="17"/>
-              </w:rPr>
-              <w:t xml:space="preserve"> </w:t>
-            </w:r>
-          </w:p>
-        </w:tc>
-      </w:tr>
-      <w:tr>
-        <w:trPr>
-          <w:trHeight w:val="290" w:hRule="atLeast"/>
-          <w:cantSplit/>
-        </w:trPr>
-        <w:tc>
-          <w:tcPr>
-            <w:tcW w:type="dxa" w:w="15700"/>
-            <w:gridSpan w:val="4"/>
-            <w:shd w:val="clear" w:color="auto" w:fill="D9D9D9"/>
-          </w:tcPr>
-          <w:p>
-            <w:pPr>
-              <w:keepNext/>
+              <w:pageBreakBefore w:val="0"/>
               <w:spacing w:before="0" w:after="0"/>
             </w:pPr>
             <w:r>

</xml_diff>

<commit_message>
Toplantı Tutanağı Word şablonu: tek konu tablosu, boş sayfa yapan ayrı sayfa kırma kaldırıldı (#486)
Claude-Session: https://claude.ai/code/session_01J6foNXTwf1dGzDjULYpfrk

Co-authored-by: Claude <noreply@anthropic.com>
</commit_message>
<xml_diff>
--- a/formlar/15. İç Denetim ve Yönetim Gözden Geçirme/EMS.YS.FRM.11.07. Toplantı Tutanağı Formu.docx
+++ b/formlar/15. İç Denetim ve Yönetim Gözden Geçirme/EMS.YS.FRM.11.07. Toplantı Tutanağı Formu.docx
@@ -2634,7 +2634,7 @@
           </w:tcPr>
           <w:p>
             <w:pPr>
-              <w:keepNext/>
+              <w:pageBreakBefore w:val="0"/>
               <w:spacing w:before="0" w:after="0"/>
             </w:pPr>
             <w:r>
@@ -3151,181 +3151,532 @@
           </w:p>
         </w:tc>
       </w:tr>
-    </w:tbl>
-    <w:p>
-      <w:pPr>
-        <w:pageBreakBefore/>
-        <w:spacing w:line="30" w:lineRule="exact" w:before="0" w:after="0"/>
-      </w:pPr>
-    </w:p>
-    <w:tbl>
-      <w:tblPr>
-        <w:tblW w:type="dxa" w:w="15700"/>
-        <w:tblLook w:firstColumn="1" w:firstRow="1" w:lastColumn="0" w:lastRow="0" w:noHBand="0" w:noVBand="1" w:val="04A0"/>
-        <w:tblBorders>
-          <w:top w:val="single" w:sz="4" w:space="0" w:color="000000"/>
-          <w:left w:val="single" w:sz="4" w:space="0" w:color="000000"/>
-          <w:bottom w:val="single" w:sz="4" w:space="0" w:color="000000"/>
-          <w:right w:val="single" w:sz="4" w:space="0" w:color="000000"/>
-          <w:insideH w:val="single" w:sz="4" w:space="0" w:color="000000"/>
-          <w:insideV w:val="single" w:sz="4" w:space="0" w:color="000000"/>
-        </w:tblBorders>
-        <w:tblLayout w:type="fixed"/>
-        <w:tblCellMar>
-          <w:top w:w="12" w:type="dxa"/>
-          <w:left w:w="70" w:type="dxa"/>
-          <w:bottom w:w="12" w:type="dxa"/>
-          <w:right w:w="70" w:type="dxa"/>
-        </w:tblCellMar>
-      </w:tblPr>
-      <w:tblGrid>
-        <w:gridCol w:w="7000"/>
-        <w:gridCol w:w="4300"/>
-        <w:gridCol w:w="2400"/>
-        <w:gridCol w:w="2000"/>
-      </w:tblGrid>
       <w:tr>
         <w:trPr>
-          <w:trHeight w:val="330" w:hRule="atLeast"/>
-          <w:tblHeader/>
+          <w:trHeight w:val="290" w:hRule="atLeast"/>
+          <w:cantSplit/>
         </w:trPr>
         <w:tc>
           <w:tcPr>
+            <w:tcW w:type="dxa" w:w="15700"/>
+            <w:gridSpan w:val="4"/>
+            <w:shd w:val="clear" w:color="auto" w:fill="D9D9D9"/>
+          </w:tcPr>
+          <w:p>
+            <w:pPr>
+              <w:pageBreakBefore/>
+              <w:spacing w:before="0" w:after="0"/>
+            </w:pPr>
+            <w:r>
+              <w:rPr>
+                <w:rFonts w:ascii="Calibri" w:hAnsi="Calibri" w:cs="Arial"/>
+                <w:b/>
+                <w:sz w:val="18"/>
+                <w:szCs w:val="18"/>
+              </w:rPr>
+              <w:t>2. ÖRGÜ &amp; BOYA</w:t>
+            </w:r>
+            <w:r>
+              <w:rPr>
+                <w:rFonts w:ascii="Calibri" w:hAnsi="Calibri" w:cs="Arial"/>
+                <w:b w:val="0"/>
+                <w:color w:val="555555"/>
+                <w:sz w:val="15"/>
+                <w:szCs w:val="15"/>
+              </w:rPr>
+              <w:t xml:space="preserve">  Knitting &amp; Dyeing</w:t>
+            </w:r>
+          </w:p>
+        </w:tc>
+      </w:tr>
+      <w:tr>
+        <w:trPr>
+          <w:trHeight w:val="295" w:hRule="atLeast"/>
+          <w:cantSplit/>
+        </w:trPr>
+        <w:tc>
+          <w:tcPr>
             <w:tcW w:type="dxa" w:w="7000"/>
-            <w:shd w:val="clear" w:color="auto" w:fill="F2F2F2"/>
-          </w:tcPr>
-          <w:p>
-            <w:pPr>
-              <w:spacing w:before="0" w:after="0"/>
-            </w:pPr>
-            <w:r>
-              <w:rPr>
-                <w:rFonts w:ascii="Calibri" w:hAnsi="Calibri" w:cs="Arial"/>
-                <w:b/>
-                <w:sz w:val="17"/>
-                <w:szCs w:val="17"/>
-              </w:rPr>
-              <w:t>Görüşülen Konu ve Alınan Karar</w:t>
-            </w:r>
-          </w:p>
-          <w:p>
-            <w:pPr>
-              <w:spacing w:before="0" w:after="0"/>
-            </w:pPr>
-            <w:r>
-              <w:rPr>
-                <w:rFonts w:ascii="Calibri" w:hAnsi="Calibri" w:cs="Arial"/>
-                <w:b w:val="0"/>
-                <w:color w:val="555555"/>
-                <w:sz w:val="12"/>
-                <w:szCs w:val="12"/>
-              </w:rPr>
-              <w:t>Topic Discussed and Decision Taken</w:t>
+          </w:tcPr>
+          <w:p>
+            <w:pPr>
+              <w:spacing w:before="0" w:after="0"/>
+            </w:pPr>
+            <w:r>
+              <w:rPr>
+                <w:rFonts w:ascii="Calibri" w:hAnsi="Calibri" w:cs="Arial"/>
+                <w:b w:val="0"/>
+                <w:sz w:val="17"/>
+                <w:szCs w:val="17"/>
+              </w:rPr>
+              <w:t xml:space="preserve"> </w:t>
             </w:r>
           </w:p>
         </w:tc>
         <w:tc>
           <w:tcPr>
             <w:tcW w:type="dxa" w:w="4300"/>
-            <w:shd w:val="clear" w:color="auto" w:fill="F2F2F2"/>
-          </w:tcPr>
-          <w:p>
-            <w:pPr>
-              <w:spacing w:before="0" w:after="0"/>
-            </w:pPr>
-            <w:r>
-              <w:rPr>
-                <w:rFonts w:ascii="Calibri" w:hAnsi="Calibri" w:cs="Arial"/>
-                <w:b/>
-                <w:sz w:val="17"/>
-                <w:szCs w:val="17"/>
-              </w:rPr>
-              <w:t>Aksiyon</w:t>
-            </w:r>
-          </w:p>
-          <w:p>
-            <w:pPr>
-              <w:spacing w:before="0" w:after="0"/>
-            </w:pPr>
-            <w:r>
-              <w:rPr>
-                <w:rFonts w:ascii="Calibri" w:hAnsi="Calibri" w:cs="Arial"/>
-                <w:b w:val="0"/>
-                <w:color w:val="555555"/>
-                <w:sz w:val="12"/>
-                <w:szCs w:val="12"/>
-              </w:rPr>
-              <w:t>Action</w:t>
+          </w:tcPr>
+          <w:p>
+            <w:pPr>
+              <w:spacing w:before="0" w:after="0"/>
+            </w:pPr>
+            <w:r>
+              <w:rPr>
+                <w:rFonts w:ascii="Calibri" w:hAnsi="Calibri" w:cs="Arial"/>
+                <w:b w:val="0"/>
+                <w:sz w:val="17"/>
+                <w:szCs w:val="17"/>
+              </w:rPr>
+              <w:t xml:space="preserve"> </w:t>
             </w:r>
           </w:p>
         </w:tc>
         <w:tc>
           <w:tcPr>
             <w:tcW w:type="dxa" w:w="2400"/>
-            <w:shd w:val="clear" w:color="auto" w:fill="F2F2F2"/>
-          </w:tcPr>
-          <w:p>
-            <w:pPr>
-              <w:spacing w:before="0" w:after="0"/>
-            </w:pPr>
-            <w:r>
-              <w:rPr>
-                <w:rFonts w:ascii="Calibri" w:hAnsi="Calibri" w:cs="Arial"/>
-                <w:b/>
-                <w:sz w:val="17"/>
-                <w:szCs w:val="17"/>
-              </w:rPr>
-              <w:t>Sorumlu</w:t>
-            </w:r>
-          </w:p>
-          <w:p>
-            <w:pPr>
-              <w:spacing w:before="0" w:after="0"/>
-            </w:pPr>
-            <w:r>
-              <w:rPr>
-                <w:rFonts w:ascii="Calibri" w:hAnsi="Calibri" w:cs="Arial"/>
-                <w:b w:val="0"/>
-                <w:color w:val="555555"/>
-                <w:sz w:val="12"/>
-                <w:szCs w:val="12"/>
-              </w:rPr>
-              <w:t>Owner</w:t>
+          </w:tcPr>
+          <w:p>
+            <w:pPr>
+              <w:spacing w:before="0" w:after="0"/>
+            </w:pPr>
+            <w:r>
+              <w:rPr>
+                <w:rFonts w:ascii="Calibri" w:hAnsi="Calibri" w:cs="Arial"/>
+                <w:b w:val="0"/>
+                <w:sz w:val="17"/>
+                <w:szCs w:val="17"/>
+              </w:rPr>
+              <w:t xml:space="preserve"> </w:t>
             </w:r>
           </w:p>
         </w:tc>
         <w:tc>
           <w:tcPr>
             <w:tcW w:type="dxa" w:w="2000"/>
-            <w:shd w:val="clear" w:color="auto" w:fill="F2F2F2"/>
-          </w:tcPr>
-          <w:p>
-            <w:pPr>
-              <w:spacing w:before="0" w:after="0"/>
-            </w:pPr>
-            <w:r>
-              <w:rPr>
-                <w:rFonts w:ascii="Calibri" w:hAnsi="Calibri" w:cs="Arial"/>
-                <w:b/>
-                <w:sz w:val="17"/>
-                <w:szCs w:val="17"/>
-              </w:rPr>
-              <w:t>Termin</w:t>
-            </w:r>
-          </w:p>
-          <w:p>
-            <w:pPr>
-              <w:spacing w:before="0" w:after="0"/>
-            </w:pPr>
-            <w:r>
-              <w:rPr>
-                <w:rFonts w:ascii="Calibri" w:hAnsi="Calibri" w:cs="Arial"/>
-                <w:b w:val="0"/>
-                <w:color w:val="555555"/>
-                <w:sz w:val="12"/>
-                <w:szCs w:val="12"/>
-              </w:rPr>
-              <w:t>Due Date</w:t>
+          </w:tcPr>
+          <w:p>
+            <w:pPr>
+              <w:spacing w:before="0" w:after="0"/>
+            </w:pPr>
+            <w:r>
+              <w:rPr>
+                <w:rFonts w:ascii="Calibri" w:hAnsi="Calibri" w:cs="Arial"/>
+                <w:b w:val="0"/>
+                <w:sz w:val="17"/>
+                <w:szCs w:val="17"/>
+              </w:rPr>
+              <w:t xml:space="preserve"> </w:t>
+            </w:r>
+          </w:p>
+        </w:tc>
+      </w:tr>
+      <w:tr>
+        <w:trPr>
+          <w:trHeight w:val="295" w:hRule="atLeast"/>
+          <w:cantSplit/>
+        </w:trPr>
+        <w:tc>
+          <w:tcPr>
+            <w:tcW w:type="dxa" w:w="7000"/>
+          </w:tcPr>
+          <w:p>
+            <w:pPr>
+              <w:spacing w:before="0" w:after="0"/>
+            </w:pPr>
+            <w:r>
+              <w:rPr>
+                <w:rFonts w:ascii="Calibri" w:hAnsi="Calibri" w:cs="Arial"/>
+                <w:b w:val="0"/>
+                <w:sz w:val="17"/>
+                <w:szCs w:val="17"/>
+              </w:rPr>
+              <w:t xml:space="preserve"> </w:t>
+            </w:r>
+          </w:p>
+        </w:tc>
+        <w:tc>
+          <w:tcPr>
+            <w:tcW w:type="dxa" w:w="4300"/>
+          </w:tcPr>
+          <w:p>
+            <w:pPr>
+              <w:spacing w:before="0" w:after="0"/>
+            </w:pPr>
+            <w:r>
+              <w:rPr>
+                <w:rFonts w:ascii="Calibri" w:hAnsi="Calibri" w:cs="Arial"/>
+                <w:b w:val="0"/>
+                <w:sz w:val="17"/>
+                <w:szCs w:val="17"/>
+              </w:rPr>
+              <w:t xml:space="preserve"> </w:t>
+            </w:r>
+          </w:p>
+        </w:tc>
+        <w:tc>
+          <w:tcPr>
+            <w:tcW w:type="dxa" w:w="2400"/>
+          </w:tcPr>
+          <w:p>
+            <w:pPr>
+              <w:spacing w:before="0" w:after="0"/>
+            </w:pPr>
+            <w:r>
+              <w:rPr>
+                <w:rFonts w:ascii="Calibri" w:hAnsi="Calibri" w:cs="Arial"/>
+                <w:b w:val="0"/>
+                <w:sz w:val="17"/>
+                <w:szCs w:val="17"/>
+              </w:rPr>
+              <w:t xml:space="preserve"> </w:t>
+            </w:r>
+          </w:p>
+        </w:tc>
+        <w:tc>
+          <w:tcPr>
+            <w:tcW w:type="dxa" w:w="2000"/>
+          </w:tcPr>
+          <w:p>
+            <w:pPr>
+              <w:spacing w:before="0" w:after="0"/>
+            </w:pPr>
+            <w:r>
+              <w:rPr>
+                <w:rFonts w:ascii="Calibri" w:hAnsi="Calibri" w:cs="Arial"/>
+                <w:b w:val="0"/>
+                <w:sz w:val="17"/>
+                <w:szCs w:val="17"/>
+              </w:rPr>
+              <w:t xml:space="preserve"> </w:t>
+            </w:r>
+          </w:p>
+        </w:tc>
+      </w:tr>
+      <w:tr>
+        <w:trPr>
+          <w:trHeight w:val="295" w:hRule="atLeast"/>
+          <w:cantSplit/>
+        </w:trPr>
+        <w:tc>
+          <w:tcPr>
+            <w:tcW w:type="dxa" w:w="7000"/>
+          </w:tcPr>
+          <w:p>
+            <w:pPr>
+              <w:spacing w:before="0" w:after="0"/>
+            </w:pPr>
+            <w:r>
+              <w:rPr>
+                <w:rFonts w:ascii="Calibri" w:hAnsi="Calibri" w:cs="Arial"/>
+                <w:b w:val="0"/>
+                <w:sz w:val="17"/>
+                <w:szCs w:val="17"/>
+              </w:rPr>
+              <w:t xml:space="preserve"> </w:t>
+            </w:r>
+          </w:p>
+        </w:tc>
+        <w:tc>
+          <w:tcPr>
+            <w:tcW w:type="dxa" w:w="4300"/>
+          </w:tcPr>
+          <w:p>
+            <w:pPr>
+              <w:spacing w:before="0" w:after="0"/>
+            </w:pPr>
+            <w:r>
+              <w:rPr>
+                <w:rFonts w:ascii="Calibri" w:hAnsi="Calibri" w:cs="Arial"/>
+                <w:b w:val="0"/>
+                <w:sz w:val="17"/>
+                <w:szCs w:val="17"/>
+              </w:rPr>
+              <w:t xml:space="preserve"> </w:t>
+            </w:r>
+          </w:p>
+        </w:tc>
+        <w:tc>
+          <w:tcPr>
+            <w:tcW w:type="dxa" w:w="2400"/>
+          </w:tcPr>
+          <w:p>
+            <w:pPr>
+              <w:spacing w:before="0" w:after="0"/>
+            </w:pPr>
+            <w:r>
+              <w:rPr>
+                <w:rFonts w:ascii="Calibri" w:hAnsi="Calibri" w:cs="Arial"/>
+                <w:b w:val="0"/>
+                <w:sz w:val="17"/>
+                <w:szCs w:val="17"/>
+              </w:rPr>
+              <w:t xml:space="preserve"> </w:t>
+            </w:r>
+          </w:p>
+        </w:tc>
+        <w:tc>
+          <w:tcPr>
+            <w:tcW w:type="dxa" w:w="2000"/>
+          </w:tcPr>
+          <w:p>
+            <w:pPr>
+              <w:spacing w:before="0" w:after="0"/>
+            </w:pPr>
+            <w:r>
+              <w:rPr>
+                <w:rFonts w:ascii="Calibri" w:hAnsi="Calibri" w:cs="Arial"/>
+                <w:b w:val="0"/>
+                <w:sz w:val="17"/>
+                <w:szCs w:val="17"/>
+              </w:rPr>
+              <w:t xml:space="preserve"> </w:t>
+            </w:r>
+          </w:p>
+        </w:tc>
+      </w:tr>
+      <w:tr>
+        <w:trPr>
+          <w:trHeight w:val="295" w:hRule="atLeast"/>
+          <w:cantSplit/>
+        </w:trPr>
+        <w:tc>
+          <w:tcPr>
+            <w:tcW w:type="dxa" w:w="7000"/>
+          </w:tcPr>
+          <w:p>
+            <w:pPr>
+              <w:spacing w:before="0" w:after="0"/>
+            </w:pPr>
+            <w:r>
+              <w:rPr>
+                <w:rFonts w:ascii="Calibri" w:hAnsi="Calibri" w:cs="Arial"/>
+                <w:b w:val="0"/>
+                <w:sz w:val="17"/>
+                <w:szCs w:val="17"/>
+              </w:rPr>
+              <w:t xml:space="preserve"> </w:t>
+            </w:r>
+          </w:p>
+        </w:tc>
+        <w:tc>
+          <w:tcPr>
+            <w:tcW w:type="dxa" w:w="4300"/>
+          </w:tcPr>
+          <w:p>
+            <w:pPr>
+              <w:spacing w:before="0" w:after="0"/>
+            </w:pPr>
+            <w:r>
+              <w:rPr>
+                <w:rFonts w:ascii="Calibri" w:hAnsi="Calibri" w:cs="Arial"/>
+                <w:b w:val="0"/>
+                <w:sz w:val="17"/>
+                <w:szCs w:val="17"/>
+              </w:rPr>
+              <w:t xml:space="preserve"> </w:t>
+            </w:r>
+          </w:p>
+        </w:tc>
+        <w:tc>
+          <w:tcPr>
+            <w:tcW w:type="dxa" w:w="2400"/>
+          </w:tcPr>
+          <w:p>
+            <w:pPr>
+              <w:spacing w:before="0" w:after="0"/>
+            </w:pPr>
+            <w:r>
+              <w:rPr>
+                <w:rFonts w:ascii="Calibri" w:hAnsi="Calibri" w:cs="Arial"/>
+                <w:b w:val="0"/>
+                <w:sz w:val="17"/>
+                <w:szCs w:val="17"/>
+              </w:rPr>
+              <w:t xml:space="preserve"> </w:t>
+            </w:r>
+          </w:p>
+        </w:tc>
+        <w:tc>
+          <w:tcPr>
+            <w:tcW w:type="dxa" w:w="2000"/>
+          </w:tcPr>
+          <w:p>
+            <w:pPr>
+              <w:spacing w:before="0" w:after="0"/>
+            </w:pPr>
+            <w:r>
+              <w:rPr>
+                <w:rFonts w:ascii="Calibri" w:hAnsi="Calibri" w:cs="Arial"/>
+                <w:b w:val="0"/>
+                <w:sz w:val="17"/>
+                <w:szCs w:val="17"/>
+              </w:rPr>
+              <w:t xml:space="preserve"> </w:t>
+            </w:r>
+          </w:p>
+        </w:tc>
+      </w:tr>
+      <w:tr>
+        <w:trPr>
+          <w:trHeight w:val="295" w:hRule="atLeast"/>
+          <w:cantSplit/>
+        </w:trPr>
+        <w:tc>
+          <w:tcPr>
+            <w:tcW w:type="dxa" w:w="7000"/>
+          </w:tcPr>
+          <w:p>
+            <w:pPr>
+              <w:spacing w:before="0" w:after="0"/>
+            </w:pPr>
+            <w:r>
+              <w:rPr>
+                <w:rFonts w:ascii="Calibri" w:hAnsi="Calibri" w:cs="Arial"/>
+                <w:b w:val="0"/>
+                <w:sz w:val="17"/>
+                <w:szCs w:val="17"/>
+              </w:rPr>
+              <w:t xml:space="preserve"> </w:t>
+            </w:r>
+          </w:p>
+        </w:tc>
+        <w:tc>
+          <w:tcPr>
+            <w:tcW w:type="dxa" w:w="4300"/>
+          </w:tcPr>
+          <w:p>
+            <w:pPr>
+              <w:spacing w:before="0" w:after="0"/>
+            </w:pPr>
+            <w:r>
+              <w:rPr>
+                <w:rFonts w:ascii="Calibri" w:hAnsi="Calibri" w:cs="Arial"/>
+                <w:b w:val="0"/>
+                <w:sz w:val="17"/>
+                <w:szCs w:val="17"/>
+              </w:rPr>
+              <w:t xml:space="preserve"> </w:t>
+            </w:r>
+          </w:p>
+        </w:tc>
+        <w:tc>
+          <w:tcPr>
+            <w:tcW w:type="dxa" w:w="2400"/>
+          </w:tcPr>
+          <w:p>
+            <w:pPr>
+              <w:spacing w:before="0" w:after="0"/>
+            </w:pPr>
+            <w:r>
+              <w:rPr>
+                <w:rFonts w:ascii="Calibri" w:hAnsi="Calibri" w:cs="Arial"/>
+                <w:b w:val="0"/>
+                <w:sz w:val="17"/>
+                <w:szCs w:val="17"/>
+              </w:rPr>
+              <w:t xml:space="preserve"> </w:t>
+            </w:r>
+          </w:p>
+        </w:tc>
+        <w:tc>
+          <w:tcPr>
+            <w:tcW w:type="dxa" w:w="2000"/>
+          </w:tcPr>
+          <w:p>
+            <w:pPr>
+              <w:spacing w:before="0" w:after="0"/>
+            </w:pPr>
+            <w:r>
+              <w:rPr>
+                <w:rFonts w:ascii="Calibri" w:hAnsi="Calibri" w:cs="Arial"/>
+                <w:b w:val="0"/>
+                <w:sz w:val="17"/>
+                <w:szCs w:val="17"/>
+              </w:rPr>
+              <w:t xml:space="preserve"> </w:t>
+            </w:r>
+          </w:p>
+        </w:tc>
+      </w:tr>
+      <w:tr>
+        <w:trPr>
+          <w:trHeight w:val="295" w:hRule="atLeast"/>
+          <w:cantSplit/>
+        </w:trPr>
+        <w:tc>
+          <w:tcPr>
+            <w:tcW w:type="dxa" w:w="7000"/>
+          </w:tcPr>
+          <w:p>
+            <w:pPr>
+              <w:spacing w:before="0" w:after="0"/>
+            </w:pPr>
+            <w:r>
+              <w:rPr>
+                <w:rFonts w:ascii="Calibri" w:hAnsi="Calibri" w:cs="Arial"/>
+                <w:b w:val="0"/>
+                <w:sz w:val="17"/>
+                <w:szCs w:val="17"/>
+              </w:rPr>
+              <w:t xml:space="preserve"> </w:t>
+            </w:r>
+          </w:p>
+        </w:tc>
+        <w:tc>
+          <w:tcPr>
+            <w:tcW w:type="dxa" w:w="4300"/>
+          </w:tcPr>
+          <w:p>
+            <w:pPr>
+              <w:spacing w:before="0" w:after="0"/>
+            </w:pPr>
+            <w:r>
+              <w:rPr>
+                <w:rFonts w:ascii="Calibri" w:hAnsi="Calibri" w:cs="Arial"/>
+                <w:b w:val="0"/>
+                <w:sz w:val="17"/>
+                <w:szCs w:val="17"/>
+              </w:rPr>
+              <w:t xml:space="preserve"> </w:t>
+            </w:r>
+          </w:p>
+        </w:tc>
+        <w:tc>
+          <w:tcPr>
+            <w:tcW w:type="dxa" w:w="2400"/>
+          </w:tcPr>
+          <w:p>
+            <w:pPr>
+              <w:spacing w:before="0" w:after="0"/>
+            </w:pPr>
+            <w:r>
+              <w:rPr>
+                <w:rFonts w:ascii="Calibri" w:hAnsi="Calibri" w:cs="Arial"/>
+                <w:b w:val="0"/>
+                <w:sz w:val="17"/>
+                <w:szCs w:val="17"/>
+              </w:rPr>
+              <w:t xml:space="preserve"> </w:t>
+            </w:r>
+          </w:p>
+        </w:tc>
+        <w:tc>
+          <w:tcPr>
+            <w:tcW w:type="dxa" w:w="2000"/>
+          </w:tcPr>
+          <w:p>
+            <w:pPr>
+              <w:spacing w:before="0" w:after="0"/>
+            </w:pPr>
+            <w:r>
+              <w:rPr>
+                <w:rFonts w:ascii="Calibri" w:hAnsi="Calibri" w:cs="Arial"/>
+                <w:b w:val="0"/>
+                <w:sz w:val="17"/>
+                <w:szCs w:val="17"/>
+              </w:rPr>
+              <w:t xml:space="preserve"> </w:t>
             </w:r>
           </w:p>
         </w:tc>
@@ -3343,7 +3694,7 @@
           </w:tcPr>
           <w:p>
             <w:pPr>
-              <w:keepNext/>
+              <w:pageBreakBefore w:val="0"/>
               <w:spacing w:before="0" w:after="0"/>
             </w:pPr>
             <w:r>
@@ -3353,7 +3704,7 @@
                 <w:sz w:val="18"/>
                 <w:szCs w:val="18"/>
               </w:rPr>
-              <w:t>2. ÖRGÜ &amp; BOYA</w:t>
+              <w:t>3. MAKİNE &amp; ENERJİ</w:t>
             </w:r>
             <w:r>
               <w:rPr>
@@ -3363,7 +3714,7 @@
                 <w:sz w:val="15"/>
                 <w:szCs w:val="15"/>
               </w:rPr>
-              <w:t xml:space="preserve">  Knitting &amp; Dyeing</w:t>
+              <w:t xml:space="preserve">  Machinery &amp; Energy</w:t>
             </w:r>
           </w:p>
         </w:tc>
@@ -3873,537 +4224,7 @@
           </w:tcPr>
           <w:p>
             <w:pPr>
-              <w:keepNext/>
-              <w:spacing w:before="0" w:after="0"/>
-            </w:pPr>
-            <w:r>
-              <w:rPr>
-                <w:rFonts w:ascii="Calibri" w:hAnsi="Calibri" w:cs="Arial"/>
-                <w:b/>
-                <w:sz w:val="18"/>
-                <w:szCs w:val="18"/>
-              </w:rPr>
-              <w:t>3. MAKİNE &amp; ENERJİ</w:t>
-            </w:r>
-            <w:r>
-              <w:rPr>
-                <w:rFonts w:ascii="Calibri" w:hAnsi="Calibri" w:cs="Arial"/>
-                <w:b w:val="0"/>
-                <w:color w:val="555555"/>
-                <w:sz w:val="15"/>
-                <w:szCs w:val="15"/>
-              </w:rPr>
-              <w:t xml:space="preserve">  Machinery &amp; Energy</w:t>
-            </w:r>
-          </w:p>
-        </w:tc>
-      </w:tr>
-      <w:tr>
-        <w:trPr>
-          <w:trHeight w:val="295" w:hRule="atLeast"/>
-          <w:cantSplit/>
-        </w:trPr>
-        <w:tc>
-          <w:tcPr>
-            <w:tcW w:type="dxa" w:w="7000"/>
-          </w:tcPr>
-          <w:p>
-            <w:pPr>
-              <w:spacing w:before="0" w:after="0"/>
-            </w:pPr>
-            <w:r>
-              <w:rPr>
-                <w:rFonts w:ascii="Calibri" w:hAnsi="Calibri" w:cs="Arial"/>
-                <w:b w:val="0"/>
-                <w:sz w:val="17"/>
-                <w:szCs w:val="17"/>
-              </w:rPr>
-              <w:t xml:space="preserve"> </w:t>
-            </w:r>
-          </w:p>
-        </w:tc>
-        <w:tc>
-          <w:tcPr>
-            <w:tcW w:type="dxa" w:w="4300"/>
-          </w:tcPr>
-          <w:p>
-            <w:pPr>
-              <w:spacing w:before="0" w:after="0"/>
-            </w:pPr>
-            <w:r>
-              <w:rPr>
-                <w:rFonts w:ascii="Calibri" w:hAnsi="Calibri" w:cs="Arial"/>
-                <w:b w:val="0"/>
-                <w:sz w:val="17"/>
-                <w:szCs w:val="17"/>
-              </w:rPr>
-              <w:t xml:space="preserve"> </w:t>
-            </w:r>
-          </w:p>
-        </w:tc>
-        <w:tc>
-          <w:tcPr>
-            <w:tcW w:type="dxa" w:w="2400"/>
-          </w:tcPr>
-          <w:p>
-            <w:pPr>
-              <w:spacing w:before="0" w:after="0"/>
-            </w:pPr>
-            <w:r>
-              <w:rPr>
-                <w:rFonts w:ascii="Calibri" w:hAnsi="Calibri" w:cs="Arial"/>
-                <w:b w:val="0"/>
-                <w:sz w:val="17"/>
-                <w:szCs w:val="17"/>
-              </w:rPr>
-              <w:t xml:space="preserve"> </w:t>
-            </w:r>
-          </w:p>
-        </w:tc>
-        <w:tc>
-          <w:tcPr>
-            <w:tcW w:type="dxa" w:w="2000"/>
-          </w:tcPr>
-          <w:p>
-            <w:pPr>
-              <w:spacing w:before="0" w:after="0"/>
-            </w:pPr>
-            <w:r>
-              <w:rPr>
-                <w:rFonts w:ascii="Calibri" w:hAnsi="Calibri" w:cs="Arial"/>
-                <w:b w:val="0"/>
-                <w:sz w:val="17"/>
-                <w:szCs w:val="17"/>
-              </w:rPr>
-              <w:t xml:space="preserve"> </w:t>
-            </w:r>
-          </w:p>
-        </w:tc>
-      </w:tr>
-      <w:tr>
-        <w:trPr>
-          <w:trHeight w:val="295" w:hRule="atLeast"/>
-          <w:cantSplit/>
-        </w:trPr>
-        <w:tc>
-          <w:tcPr>
-            <w:tcW w:type="dxa" w:w="7000"/>
-          </w:tcPr>
-          <w:p>
-            <w:pPr>
-              <w:spacing w:before="0" w:after="0"/>
-            </w:pPr>
-            <w:r>
-              <w:rPr>
-                <w:rFonts w:ascii="Calibri" w:hAnsi="Calibri" w:cs="Arial"/>
-                <w:b w:val="0"/>
-                <w:sz w:val="17"/>
-                <w:szCs w:val="17"/>
-              </w:rPr>
-              <w:t xml:space="preserve"> </w:t>
-            </w:r>
-          </w:p>
-        </w:tc>
-        <w:tc>
-          <w:tcPr>
-            <w:tcW w:type="dxa" w:w="4300"/>
-          </w:tcPr>
-          <w:p>
-            <w:pPr>
-              <w:spacing w:before="0" w:after="0"/>
-            </w:pPr>
-            <w:r>
-              <w:rPr>
-                <w:rFonts w:ascii="Calibri" w:hAnsi="Calibri" w:cs="Arial"/>
-                <w:b w:val="0"/>
-                <w:sz w:val="17"/>
-                <w:szCs w:val="17"/>
-              </w:rPr>
-              <w:t xml:space="preserve"> </w:t>
-            </w:r>
-          </w:p>
-        </w:tc>
-        <w:tc>
-          <w:tcPr>
-            <w:tcW w:type="dxa" w:w="2400"/>
-          </w:tcPr>
-          <w:p>
-            <w:pPr>
-              <w:spacing w:before="0" w:after="0"/>
-            </w:pPr>
-            <w:r>
-              <w:rPr>
-                <w:rFonts w:ascii="Calibri" w:hAnsi="Calibri" w:cs="Arial"/>
-                <w:b w:val="0"/>
-                <w:sz w:val="17"/>
-                <w:szCs w:val="17"/>
-              </w:rPr>
-              <w:t xml:space="preserve"> </w:t>
-            </w:r>
-          </w:p>
-        </w:tc>
-        <w:tc>
-          <w:tcPr>
-            <w:tcW w:type="dxa" w:w="2000"/>
-          </w:tcPr>
-          <w:p>
-            <w:pPr>
-              <w:spacing w:before="0" w:after="0"/>
-            </w:pPr>
-            <w:r>
-              <w:rPr>
-                <w:rFonts w:ascii="Calibri" w:hAnsi="Calibri" w:cs="Arial"/>
-                <w:b w:val="0"/>
-                <w:sz w:val="17"/>
-                <w:szCs w:val="17"/>
-              </w:rPr>
-              <w:t xml:space="preserve"> </w:t>
-            </w:r>
-          </w:p>
-        </w:tc>
-      </w:tr>
-      <w:tr>
-        <w:trPr>
-          <w:trHeight w:val="295" w:hRule="atLeast"/>
-          <w:cantSplit/>
-        </w:trPr>
-        <w:tc>
-          <w:tcPr>
-            <w:tcW w:type="dxa" w:w="7000"/>
-          </w:tcPr>
-          <w:p>
-            <w:pPr>
-              <w:spacing w:before="0" w:after="0"/>
-            </w:pPr>
-            <w:r>
-              <w:rPr>
-                <w:rFonts w:ascii="Calibri" w:hAnsi="Calibri" w:cs="Arial"/>
-                <w:b w:val="0"/>
-                <w:sz w:val="17"/>
-                <w:szCs w:val="17"/>
-              </w:rPr>
-              <w:t xml:space="preserve"> </w:t>
-            </w:r>
-          </w:p>
-        </w:tc>
-        <w:tc>
-          <w:tcPr>
-            <w:tcW w:type="dxa" w:w="4300"/>
-          </w:tcPr>
-          <w:p>
-            <w:pPr>
-              <w:spacing w:before="0" w:after="0"/>
-            </w:pPr>
-            <w:r>
-              <w:rPr>
-                <w:rFonts w:ascii="Calibri" w:hAnsi="Calibri" w:cs="Arial"/>
-                <w:b w:val="0"/>
-                <w:sz w:val="17"/>
-                <w:szCs w:val="17"/>
-              </w:rPr>
-              <w:t xml:space="preserve"> </w:t>
-            </w:r>
-          </w:p>
-        </w:tc>
-        <w:tc>
-          <w:tcPr>
-            <w:tcW w:type="dxa" w:w="2400"/>
-          </w:tcPr>
-          <w:p>
-            <w:pPr>
-              <w:spacing w:before="0" w:after="0"/>
-            </w:pPr>
-            <w:r>
-              <w:rPr>
-                <w:rFonts w:ascii="Calibri" w:hAnsi="Calibri" w:cs="Arial"/>
-                <w:b w:val="0"/>
-                <w:sz w:val="17"/>
-                <w:szCs w:val="17"/>
-              </w:rPr>
-              <w:t xml:space="preserve"> </w:t>
-            </w:r>
-          </w:p>
-        </w:tc>
-        <w:tc>
-          <w:tcPr>
-            <w:tcW w:type="dxa" w:w="2000"/>
-          </w:tcPr>
-          <w:p>
-            <w:pPr>
-              <w:spacing w:before="0" w:after="0"/>
-            </w:pPr>
-            <w:r>
-              <w:rPr>
-                <w:rFonts w:ascii="Calibri" w:hAnsi="Calibri" w:cs="Arial"/>
-                <w:b w:val="0"/>
-                <w:sz w:val="17"/>
-                <w:szCs w:val="17"/>
-              </w:rPr>
-              <w:t xml:space="preserve"> </w:t>
-            </w:r>
-          </w:p>
-        </w:tc>
-      </w:tr>
-      <w:tr>
-        <w:trPr>
-          <w:trHeight w:val="295" w:hRule="atLeast"/>
-          <w:cantSplit/>
-        </w:trPr>
-        <w:tc>
-          <w:tcPr>
-            <w:tcW w:type="dxa" w:w="7000"/>
-          </w:tcPr>
-          <w:p>
-            <w:pPr>
-              <w:spacing w:before="0" w:after="0"/>
-            </w:pPr>
-            <w:r>
-              <w:rPr>
-                <w:rFonts w:ascii="Calibri" w:hAnsi="Calibri" w:cs="Arial"/>
-                <w:b w:val="0"/>
-                <w:sz w:val="17"/>
-                <w:szCs w:val="17"/>
-              </w:rPr>
-              <w:t xml:space="preserve"> </w:t>
-            </w:r>
-          </w:p>
-        </w:tc>
-        <w:tc>
-          <w:tcPr>
-            <w:tcW w:type="dxa" w:w="4300"/>
-          </w:tcPr>
-          <w:p>
-            <w:pPr>
-              <w:spacing w:before="0" w:after="0"/>
-            </w:pPr>
-            <w:r>
-              <w:rPr>
-                <w:rFonts w:ascii="Calibri" w:hAnsi="Calibri" w:cs="Arial"/>
-                <w:b w:val="0"/>
-                <w:sz w:val="17"/>
-                <w:szCs w:val="17"/>
-              </w:rPr>
-              <w:t xml:space="preserve"> </w:t>
-            </w:r>
-          </w:p>
-        </w:tc>
-        <w:tc>
-          <w:tcPr>
-            <w:tcW w:type="dxa" w:w="2400"/>
-          </w:tcPr>
-          <w:p>
-            <w:pPr>
-              <w:spacing w:before="0" w:after="0"/>
-            </w:pPr>
-            <w:r>
-              <w:rPr>
-                <w:rFonts w:ascii="Calibri" w:hAnsi="Calibri" w:cs="Arial"/>
-                <w:b w:val="0"/>
-                <w:sz w:val="17"/>
-                <w:szCs w:val="17"/>
-              </w:rPr>
-              <w:t xml:space="preserve"> </w:t>
-            </w:r>
-          </w:p>
-        </w:tc>
-        <w:tc>
-          <w:tcPr>
-            <w:tcW w:type="dxa" w:w="2000"/>
-          </w:tcPr>
-          <w:p>
-            <w:pPr>
-              <w:spacing w:before="0" w:after="0"/>
-            </w:pPr>
-            <w:r>
-              <w:rPr>
-                <w:rFonts w:ascii="Calibri" w:hAnsi="Calibri" w:cs="Arial"/>
-                <w:b w:val="0"/>
-                <w:sz w:val="17"/>
-                <w:szCs w:val="17"/>
-              </w:rPr>
-              <w:t xml:space="preserve"> </w:t>
-            </w:r>
-          </w:p>
-        </w:tc>
-      </w:tr>
-      <w:tr>
-        <w:trPr>
-          <w:trHeight w:val="295" w:hRule="atLeast"/>
-          <w:cantSplit/>
-        </w:trPr>
-        <w:tc>
-          <w:tcPr>
-            <w:tcW w:type="dxa" w:w="7000"/>
-          </w:tcPr>
-          <w:p>
-            <w:pPr>
-              <w:spacing w:before="0" w:after="0"/>
-            </w:pPr>
-            <w:r>
-              <w:rPr>
-                <w:rFonts w:ascii="Calibri" w:hAnsi="Calibri" w:cs="Arial"/>
-                <w:b w:val="0"/>
-                <w:sz w:val="17"/>
-                <w:szCs w:val="17"/>
-              </w:rPr>
-              <w:t xml:space="preserve"> </w:t>
-            </w:r>
-          </w:p>
-        </w:tc>
-        <w:tc>
-          <w:tcPr>
-            <w:tcW w:type="dxa" w:w="4300"/>
-          </w:tcPr>
-          <w:p>
-            <w:pPr>
-              <w:spacing w:before="0" w:after="0"/>
-            </w:pPr>
-            <w:r>
-              <w:rPr>
-                <w:rFonts w:ascii="Calibri" w:hAnsi="Calibri" w:cs="Arial"/>
-                <w:b w:val="0"/>
-                <w:sz w:val="17"/>
-                <w:szCs w:val="17"/>
-              </w:rPr>
-              <w:t xml:space="preserve"> </w:t>
-            </w:r>
-          </w:p>
-        </w:tc>
-        <w:tc>
-          <w:tcPr>
-            <w:tcW w:type="dxa" w:w="2400"/>
-          </w:tcPr>
-          <w:p>
-            <w:pPr>
-              <w:spacing w:before="0" w:after="0"/>
-            </w:pPr>
-            <w:r>
-              <w:rPr>
-                <w:rFonts w:ascii="Calibri" w:hAnsi="Calibri" w:cs="Arial"/>
-                <w:b w:val="0"/>
-                <w:sz w:val="17"/>
-                <w:szCs w:val="17"/>
-              </w:rPr>
-              <w:t xml:space="preserve"> </w:t>
-            </w:r>
-          </w:p>
-        </w:tc>
-        <w:tc>
-          <w:tcPr>
-            <w:tcW w:type="dxa" w:w="2000"/>
-          </w:tcPr>
-          <w:p>
-            <w:pPr>
-              <w:spacing w:before="0" w:after="0"/>
-            </w:pPr>
-            <w:r>
-              <w:rPr>
-                <w:rFonts w:ascii="Calibri" w:hAnsi="Calibri" w:cs="Arial"/>
-                <w:b w:val="0"/>
-                <w:sz w:val="17"/>
-                <w:szCs w:val="17"/>
-              </w:rPr>
-              <w:t xml:space="preserve"> </w:t>
-            </w:r>
-          </w:p>
-        </w:tc>
-      </w:tr>
-      <w:tr>
-        <w:trPr>
-          <w:trHeight w:val="295" w:hRule="atLeast"/>
-          <w:cantSplit/>
-        </w:trPr>
-        <w:tc>
-          <w:tcPr>
-            <w:tcW w:type="dxa" w:w="7000"/>
-          </w:tcPr>
-          <w:p>
-            <w:pPr>
-              <w:spacing w:before="0" w:after="0"/>
-            </w:pPr>
-            <w:r>
-              <w:rPr>
-                <w:rFonts w:ascii="Calibri" w:hAnsi="Calibri" w:cs="Arial"/>
-                <w:b w:val="0"/>
-                <w:sz w:val="17"/>
-                <w:szCs w:val="17"/>
-              </w:rPr>
-              <w:t xml:space="preserve"> </w:t>
-            </w:r>
-          </w:p>
-        </w:tc>
-        <w:tc>
-          <w:tcPr>
-            <w:tcW w:type="dxa" w:w="4300"/>
-          </w:tcPr>
-          <w:p>
-            <w:pPr>
-              <w:spacing w:before="0" w:after="0"/>
-            </w:pPr>
-            <w:r>
-              <w:rPr>
-                <w:rFonts w:ascii="Calibri" w:hAnsi="Calibri" w:cs="Arial"/>
-                <w:b w:val="0"/>
-                <w:sz w:val="17"/>
-                <w:szCs w:val="17"/>
-              </w:rPr>
-              <w:t xml:space="preserve"> </w:t>
-            </w:r>
-          </w:p>
-        </w:tc>
-        <w:tc>
-          <w:tcPr>
-            <w:tcW w:type="dxa" w:w="2400"/>
-          </w:tcPr>
-          <w:p>
-            <w:pPr>
-              <w:spacing w:before="0" w:after="0"/>
-            </w:pPr>
-            <w:r>
-              <w:rPr>
-                <w:rFonts w:ascii="Calibri" w:hAnsi="Calibri" w:cs="Arial"/>
-                <w:b w:val="0"/>
-                <w:sz w:val="17"/>
-                <w:szCs w:val="17"/>
-              </w:rPr>
-              <w:t xml:space="preserve"> </w:t>
-            </w:r>
-          </w:p>
-        </w:tc>
-        <w:tc>
-          <w:tcPr>
-            <w:tcW w:type="dxa" w:w="2000"/>
-          </w:tcPr>
-          <w:p>
-            <w:pPr>
-              <w:spacing w:before="0" w:after="0"/>
-            </w:pPr>
-            <w:r>
-              <w:rPr>
-                <w:rFonts w:ascii="Calibri" w:hAnsi="Calibri" w:cs="Arial"/>
-                <w:b w:val="0"/>
-                <w:sz w:val="17"/>
-                <w:szCs w:val="17"/>
-              </w:rPr>
-              <w:t xml:space="preserve"> </w:t>
-            </w:r>
-          </w:p>
-        </w:tc>
-      </w:tr>
-      <w:tr>
-        <w:trPr>
-          <w:trHeight w:val="290" w:hRule="atLeast"/>
-          <w:cantSplit/>
-        </w:trPr>
-        <w:tc>
-          <w:tcPr>
-            <w:tcW w:type="dxa" w:w="15700"/>
-            <w:gridSpan w:val="4"/>
-            <w:shd w:val="clear" w:color="auto" w:fill="D9D9D9"/>
-          </w:tcPr>
-          <w:p>
-            <w:pPr>
-              <w:keepNext/>
+              <w:pageBreakBefore w:val="0"/>
               <w:spacing w:before="0" w:after="0"/>
             </w:pPr>
             <w:r>

</xml_diff>

<commit_message>
Toplantı Tutanağı Word şablonu: gerçek bölüm sonu ile 2 sayfa, sayfa-başı/üst-bilgi tekrarı kaynaklı boş sayfa giderildi
Co-Authored-By: Claude Sonnet 5.5 <noreply@anthropic.com>
Claude-Session: https://claude.ai/code/session_01J6foNXTwf1dGzDjULYpfrk
</commit_message>
<xml_diff>
--- a/formlar/15. İç Denetim ve Yönetim Gözden Geçirme/EMS.YS.FRM.11.07. Toplantı Tutanağı Formu.docx
+++ b/formlar/15. İç Denetim ve Yönetim Gözden Geçirme/EMS.YS.FRM.11.07. Toplantı Tutanağı Formu.docx
@@ -2478,7 +2478,6 @@
       <w:tr>
         <w:trPr>
           <w:trHeight w:val="330" w:hRule="atLeast"/>
-          <w:tblHeader/>
         </w:trPr>
         <w:tc>
           <w:tcPr>
@@ -2634,7 +2633,6 @@
           </w:tcPr>
           <w:p>
             <w:pPr>
-              <w:pageBreakBefore w:val="0"/>
               <w:spacing w:before="0" w:after="0"/>
             </w:pPr>
             <w:r>
@@ -3151,6 +3149,196 @@
           </w:p>
         </w:tc>
       </w:tr>
+    </w:tbl>
+    <w:p>
+      <w:pPr>
+        <w:sectPr>
+          <w:headerReference w:type="even" r:id="rId10"/>
+          <w:headerReference w:type="default" r:id="rId11"/>
+          <w:footerReference w:type="even" r:id="rId12"/>
+          <w:footerReference w:type="default" r:id="rId13"/>
+          <w:headerReference w:type="first" r:id="rId14"/>
+          <w:footerReference w:type="first" r:id="rId15"/>
+          <w:type w:val="continuous"/>
+          <w:pgSz w:w="16838" w:h="11906" w:orient="landscape"/>
+          <w:pgMar w:top="860" w:right="567" w:bottom="300" w:left="567" w:header="300" w:footer="200" w:gutter="0"/>
+          <w:pgNumType w:chapStyle="1"/>
+          <w:cols w:space="708"/>
+          <w:docGrid w:linePitch="360"/>
+        </w:sectPr>
+      </w:pPr>
+    </w:p>
+    <w:tbl>
+      <w:tblPr>
+        <w:tblW w:type="dxa" w:w="15700"/>
+        <w:tblLook w:firstColumn="1" w:firstRow="1" w:lastColumn="0" w:lastRow="0" w:noHBand="0" w:noVBand="1" w:val="04A0"/>
+        <w:tblBorders>
+          <w:top w:val="single" w:sz="4" w:space="0" w:color="000000"/>
+          <w:left w:val="single" w:sz="4" w:space="0" w:color="000000"/>
+          <w:bottom w:val="single" w:sz="4" w:space="0" w:color="000000"/>
+          <w:right w:val="single" w:sz="4" w:space="0" w:color="000000"/>
+          <w:insideH w:val="single" w:sz="4" w:space="0" w:color="000000"/>
+          <w:insideV w:val="single" w:sz="4" w:space="0" w:color="000000"/>
+        </w:tblBorders>
+        <w:tblLayout w:type="fixed"/>
+        <w:tblCellMar>
+          <w:top w:w="12" w:type="dxa"/>
+          <w:left w:w="70" w:type="dxa"/>
+          <w:bottom w:w="12" w:type="dxa"/>
+          <w:right w:w="70" w:type="dxa"/>
+        </w:tblCellMar>
+      </w:tblPr>
+      <w:tblGrid>
+        <w:gridCol w:w="7000"/>
+        <w:gridCol w:w="4300"/>
+        <w:gridCol w:w="2400"/>
+        <w:gridCol w:w="2000"/>
+      </w:tblGrid>
+      <w:tr>
+        <w:trPr>
+          <w:trHeight w:val="330" w:hRule="atLeast"/>
+        </w:trPr>
+        <w:tc>
+          <w:tcPr>
+            <w:tcW w:type="dxa" w:w="7000"/>
+            <w:shd w:val="clear" w:color="auto" w:fill="F2F2F2"/>
+          </w:tcPr>
+          <w:p>
+            <w:pPr>
+              <w:spacing w:before="0" w:after="0"/>
+            </w:pPr>
+            <w:r>
+              <w:rPr>
+                <w:rFonts w:ascii="Calibri" w:hAnsi="Calibri" w:cs="Arial"/>
+                <w:b/>
+                <w:sz w:val="17"/>
+                <w:szCs w:val="17"/>
+              </w:rPr>
+              <w:t>Görüşülen Konu ve Alınan Karar</w:t>
+            </w:r>
+          </w:p>
+          <w:p>
+            <w:pPr>
+              <w:spacing w:before="0" w:after="0"/>
+            </w:pPr>
+            <w:r>
+              <w:rPr>
+                <w:rFonts w:ascii="Calibri" w:hAnsi="Calibri" w:cs="Arial"/>
+                <w:b w:val="0"/>
+                <w:color w:val="555555"/>
+                <w:sz w:val="12"/>
+                <w:szCs w:val="12"/>
+              </w:rPr>
+              <w:t>Topic Discussed and Decision Taken</w:t>
+            </w:r>
+          </w:p>
+        </w:tc>
+        <w:tc>
+          <w:tcPr>
+            <w:tcW w:type="dxa" w:w="4300"/>
+            <w:shd w:val="clear" w:color="auto" w:fill="F2F2F2"/>
+          </w:tcPr>
+          <w:p>
+            <w:pPr>
+              <w:spacing w:before="0" w:after="0"/>
+            </w:pPr>
+            <w:r>
+              <w:rPr>
+                <w:rFonts w:ascii="Calibri" w:hAnsi="Calibri" w:cs="Arial"/>
+                <w:b/>
+                <w:sz w:val="17"/>
+                <w:szCs w:val="17"/>
+              </w:rPr>
+              <w:t>Aksiyon</w:t>
+            </w:r>
+          </w:p>
+          <w:p>
+            <w:pPr>
+              <w:spacing w:before="0" w:after="0"/>
+            </w:pPr>
+            <w:r>
+              <w:rPr>
+                <w:rFonts w:ascii="Calibri" w:hAnsi="Calibri" w:cs="Arial"/>
+                <w:b w:val="0"/>
+                <w:color w:val="555555"/>
+                <w:sz w:val="12"/>
+                <w:szCs w:val="12"/>
+              </w:rPr>
+              <w:t>Action</w:t>
+            </w:r>
+          </w:p>
+        </w:tc>
+        <w:tc>
+          <w:tcPr>
+            <w:tcW w:type="dxa" w:w="2400"/>
+            <w:shd w:val="clear" w:color="auto" w:fill="F2F2F2"/>
+          </w:tcPr>
+          <w:p>
+            <w:pPr>
+              <w:spacing w:before="0" w:after="0"/>
+            </w:pPr>
+            <w:r>
+              <w:rPr>
+                <w:rFonts w:ascii="Calibri" w:hAnsi="Calibri" w:cs="Arial"/>
+                <w:b/>
+                <w:sz w:val="17"/>
+                <w:szCs w:val="17"/>
+              </w:rPr>
+              <w:t>Sorumlu</w:t>
+            </w:r>
+          </w:p>
+          <w:p>
+            <w:pPr>
+              <w:spacing w:before="0" w:after="0"/>
+            </w:pPr>
+            <w:r>
+              <w:rPr>
+                <w:rFonts w:ascii="Calibri" w:hAnsi="Calibri" w:cs="Arial"/>
+                <w:b w:val="0"/>
+                <w:color w:val="555555"/>
+                <w:sz w:val="12"/>
+                <w:szCs w:val="12"/>
+              </w:rPr>
+              <w:t>Owner</w:t>
+            </w:r>
+          </w:p>
+        </w:tc>
+        <w:tc>
+          <w:tcPr>
+            <w:tcW w:type="dxa" w:w="2000"/>
+            <w:shd w:val="clear" w:color="auto" w:fill="F2F2F2"/>
+          </w:tcPr>
+          <w:p>
+            <w:pPr>
+              <w:spacing w:before="0" w:after="0"/>
+            </w:pPr>
+            <w:r>
+              <w:rPr>
+                <w:rFonts w:ascii="Calibri" w:hAnsi="Calibri" w:cs="Arial"/>
+                <w:b/>
+                <w:sz w:val="17"/>
+                <w:szCs w:val="17"/>
+              </w:rPr>
+              <w:t>Termin</w:t>
+            </w:r>
+          </w:p>
+          <w:p>
+            <w:pPr>
+              <w:spacing w:before="0" w:after="0"/>
+            </w:pPr>
+            <w:r>
+              <w:rPr>
+                <w:rFonts w:ascii="Calibri" w:hAnsi="Calibri" w:cs="Arial"/>
+                <w:b w:val="0"/>
+                <w:color w:val="555555"/>
+                <w:sz w:val="12"/>
+                <w:szCs w:val="12"/>
+              </w:rPr>
+              <w:t>Due Date</w:t>
+            </w:r>
+          </w:p>
+        </w:tc>
+      </w:tr>
       <w:tr>
         <w:trPr>
           <w:trHeight w:val="290" w:hRule="atLeast"/>
@@ -3164,7 +3352,6 @@
           </w:tcPr>
           <w:p>
             <w:pPr>
-              <w:pageBreakBefore/>
               <w:spacing w:before="0" w:after="0"/>
             </w:pPr>
             <w:r>
@@ -3694,7 +3881,6 @@
           </w:tcPr>
           <w:p>
             <w:pPr>
-              <w:pageBreakBefore w:val="0"/>
               <w:spacing w:before="0" w:after="0"/>
             </w:pPr>
             <w:r>
@@ -4224,7 +4410,6 @@
           </w:tcPr>
           <w:p>
             <w:pPr>
-              <w:pageBreakBefore w:val="0"/>
               <w:spacing w:before="0" w:after="0"/>
             </w:pPr>
             <w:r>
@@ -4859,13 +5044,6 @@
       </w:pPr>
     </w:p>
     <w:sectPr>
-      <w:headerReference w:type="even" r:id="rId10"/>
-      <w:headerReference w:type="default" r:id="rId11"/>
-      <w:footerReference w:type="even" r:id="rId12"/>
-      <w:footerReference w:type="default" r:id="rId13"/>
-      <w:headerReference w:type="first" r:id="rId14"/>
-      <w:footerReference w:type="first" r:id="rId15"/>
-      <w:type w:val="continuous"/>
       <w:pgSz w:w="16838" w:h="11906" w:orient="landscape"/>
       <w:pgMar w:top="860" w:right="567" w:bottom="300" w:left="567" w:header="300" w:footer="200" w:gutter="0"/>
       <w:pgNumType w:chapStyle="1"/>

</xml_diff>

<commit_message>
Toplantı Tutanağı Word şablonu: gerçek bölüm sonu ile 2 sayfa, sayfa-başı/üst-bilgi tekrarı kaynaklı boş sayfa giderildi (#487)
Claude-Session: https://claude.ai/code/session_01J6foNXTwf1dGzDjULYpfrk

Co-authored-by: Claude <noreply@anthropic.com>
</commit_message>
<xml_diff>
--- a/formlar/15. İç Denetim ve Yönetim Gözden Geçirme/EMS.YS.FRM.11.07. Toplantı Tutanağı Formu.docx
+++ b/formlar/15. İç Denetim ve Yönetim Gözden Geçirme/EMS.YS.FRM.11.07. Toplantı Tutanağı Formu.docx
@@ -2478,7 +2478,6 @@
       <w:tr>
         <w:trPr>
           <w:trHeight w:val="330" w:hRule="atLeast"/>
-          <w:tblHeader/>
         </w:trPr>
         <w:tc>
           <w:tcPr>
@@ -2634,7 +2633,6 @@
           </w:tcPr>
           <w:p>
             <w:pPr>
-              <w:pageBreakBefore w:val="0"/>
               <w:spacing w:before="0" w:after="0"/>
             </w:pPr>
             <w:r>
@@ -3151,6 +3149,196 @@
           </w:p>
         </w:tc>
       </w:tr>
+    </w:tbl>
+    <w:p>
+      <w:pPr>
+        <w:sectPr>
+          <w:headerReference w:type="even" r:id="rId10"/>
+          <w:headerReference w:type="default" r:id="rId11"/>
+          <w:footerReference w:type="even" r:id="rId12"/>
+          <w:footerReference w:type="default" r:id="rId13"/>
+          <w:headerReference w:type="first" r:id="rId14"/>
+          <w:footerReference w:type="first" r:id="rId15"/>
+          <w:type w:val="continuous"/>
+          <w:pgSz w:w="16838" w:h="11906" w:orient="landscape"/>
+          <w:pgMar w:top="860" w:right="567" w:bottom="300" w:left="567" w:header="300" w:footer="200" w:gutter="0"/>
+          <w:pgNumType w:chapStyle="1"/>
+          <w:cols w:space="708"/>
+          <w:docGrid w:linePitch="360"/>
+        </w:sectPr>
+      </w:pPr>
+    </w:p>
+    <w:tbl>
+      <w:tblPr>
+        <w:tblW w:type="dxa" w:w="15700"/>
+        <w:tblLook w:firstColumn="1" w:firstRow="1" w:lastColumn="0" w:lastRow="0" w:noHBand="0" w:noVBand="1" w:val="04A0"/>
+        <w:tblBorders>
+          <w:top w:val="single" w:sz="4" w:space="0" w:color="000000"/>
+          <w:left w:val="single" w:sz="4" w:space="0" w:color="000000"/>
+          <w:bottom w:val="single" w:sz="4" w:space="0" w:color="000000"/>
+          <w:right w:val="single" w:sz="4" w:space="0" w:color="000000"/>
+          <w:insideH w:val="single" w:sz="4" w:space="0" w:color="000000"/>
+          <w:insideV w:val="single" w:sz="4" w:space="0" w:color="000000"/>
+        </w:tblBorders>
+        <w:tblLayout w:type="fixed"/>
+        <w:tblCellMar>
+          <w:top w:w="12" w:type="dxa"/>
+          <w:left w:w="70" w:type="dxa"/>
+          <w:bottom w:w="12" w:type="dxa"/>
+          <w:right w:w="70" w:type="dxa"/>
+        </w:tblCellMar>
+      </w:tblPr>
+      <w:tblGrid>
+        <w:gridCol w:w="7000"/>
+        <w:gridCol w:w="4300"/>
+        <w:gridCol w:w="2400"/>
+        <w:gridCol w:w="2000"/>
+      </w:tblGrid>
+      <w:tr>
+        <w:trPr>
+          <w:trHeight w:val="330" w:hRule="atLeast"/>
+        </w:trPr>
+        <w:tc>
+          <w:tcPr>
+            <w:tcW w:type="dxa" w:w="7000"/>
+            <w:shd w:val="clear" w:color="auto" w:fill="F2F2F2"/>
+          </w:tcPr>
+          <w:p>
+            <w:pPr>
+              <w:spacing w:before="0" w:after="0"/>
+            </w:pPr>
+            <w:r>
+              <w:rPr>
+                <w:rFonts w:ascii="Calibri" w:hAnsi="Calibri" w:cs="Arial"/>
+                <w:b/>
+                <w:sz w:val="17"/>
+                <w:szCs w:val="17"/>
+              </w:rPr>
+              <w:t>Görüşülen Konu ve Alınan Karar</w:t>
+            </w:r>
+          </w:p>
+          <w:p>
+            <w:pPr>
+              <w:spacing w:before="0" w:after="0"/>
+            </w:pPr>
+            <w:r>
+              <w:rPr>
+                <w:rFonts w:ascii="Calibri" w:hAnsi="Calibri" w:cs="Arial"/>
+                <w:b w:val="0"/>
+                <w:color w:val="555555"/>
+                <w:sz w:val="12"/>
+                <w:szCs w:val="12"/>
+              </w:rPr>
+              <w:t>Topic Discussed and Decision Taken</w:t>
+            </w:r>
+          </w:p>
+        </w:tc>
+        <w:tc>
+          <w:tcPr>
+            <w:tcW w:type="dxa" w:w="4300"/>
+            <w:shd w:val="clear" w:color="auto" w:fill="F2F2F2"/>
+          </w:tcPr>
+          <w:p>
+            <w:pPr>
+              <w:spacing w:before="0" w:after="0"/>
+            </w:pPr>
+            <w:r>
+              <w:rPr>
+                <w:rFonts w:ascii="Calibri" w:hAnsi="Calibri" w:cs="Arial"/>
+                <w:b/>
+                <w:sz w:val="17"/>
+                <w:szCs w:val="17"/>
+              </w:rPr>
+              <w:t>Aksiyon</w:t>
+            </w:r>
+          </w:p>
+          <w:p>
+            <w:pPr>
+              <w:spacing w:before="0" w:after="0"/>
+            </w:pPr>
+            <w:r>
+              <w:rPr>
+                <w:rFonts w:ascii="Calibri" w:hAnsi="Calibri" w:cs="Arial"/>
+                <w:b w:val="0"/>
+                <w:color w:val="555555"/>
+                <w:sz w:val="12"/>
+                <w:szCs w:val="12"/>
+              </w:rPr>
+              <w:t>Action</w:t>
+            </w:r>
+          </w:p>
+        </w:tc>
+        <w:tc>
+          <w:tcPr>
+            <w:tcW w:type="dxa" w:w="2400"/>
+            <w:shd w:val="clear" w:color="auto" w:fill="F2F2F2"/>
+          </w:tcPr>
+          <w:p>
+            <w:pPr>
+              <w:spacing w:before="0" w:after="0"/>
+            </w:pPr>
+            <w:r>
+              <w:rPr>
+                <w:rFonts w:ascii="Calibri" w:hAnsi="Calibri" w:cs="Arial"/>
+                <w:b/>
+                <w:sz w:val="17"/>
+                <w:szCs w:val="17"/>
+              </w:rPr>
+              <w:t>Sorumlu</w:t>
+            </w:r>
+          </w:p>
+          <w:p>
+            <w:pPr>
+              <w:spacing w:before="0" w:after="0"/>
+            </w:pPr>
+            <w:r>
+              <w:rPr>
+                <w:rFonts w:ascii="Calibri" w:hAnsi="Calibri" w:cs="Arial"/>
+                <w:b w:val="0"/>
+                <w:color w:val="555555"/>
+                <w:sz w:val="12"/>
+                <w:szCs w:val="12"/>
+              </w:rPr>
+              <w:t>Owner</w:t>
+            </w:r>
+          </w:p>
+        </w:tc>
+        <w:tc>
+          <w:tcPr>
+            <w:tcW w:type="dxa" w:w="2000"/>
+            <w:shd w:val="clear" w:color="auto" w:fill="F2F2F2"/>
+          </w:tcPr>
+          <w:p>
+            <w:pPr>
+              <w:spacing w:before="0" w:after="0"/>
+            </w:pPr>
+            <w:r>
+              <w:rPr>
+                <w:rFonts w:ascii="Calibri" w:hAnsi="Calibri" w:cs="Arial"/>
+                <w:b/>
+                <w:sz w:val="17"/>
+                <w:szCs w:val="17"/>
+              </w:rPr>
+              <w:t>Termin</w:t>
+            </w:r>
+          </w:p>
+          <w:p>
+            <w:pPr>
+              <w:spacing w:before="0" w:after="0"/>
+            </w:pPr>
+            <w:r>
+              <w:rPr>
+                <w:rFonts w:ascii="Calibri" w:hAnsi="Calibri" w:cs="Arial"/>
+                <w:b w:val="0"/>
+                <w:color w:val="555555"/>
+                <w:sz w:val="12"/>
+                <w:szCs w:val="12"/>
+              </w:rPr>
+              <w:t>Due Date</w:t>
+            </w:r>
+          </w:p>
+        </w:tc>
+      </w:tr>
       <w:tr>
         <w:trPr>
           <w:trHeight w:val="290" w:hRule="atLeast"/>
@@ -3164,7 +3352,6 @@
           </w:tcPr>
           <w:p>
             <w:pPr>
-              <w:pageBreakBefore/>
               <w:spacing w:before="0" w:after="0"/>
             </w:pPr>
             <w:r>
@@ -3694,7 +3881,6 @@
           </w:tcPr>
           <w:p>
             <w:pPr>
-              <w:pageBreakBefore w:val="0"/>
               <w:spacing w:before="0" w:after="0"/>
             </w:pPr>
             <w:r>
@@ -4224,7 +4410,6 @@
           </w:tcPr>
           <w:p>
             <w:pPr>
-              <w:pageBreakBefore w:val="0"/>
               <w:spacing w:before="0" w:after="0"/>
             </w:pPr>
             <w:r>
@@ -4859,13 +5044,6 @@
       </w:pPr>
     </w:p>
     <w:sectPr>
-      <w:headerReference w:type="even" r:id="rId10"/>
-      <w:headerReference w:type="default" r:id="rId11"/>
-      <w:footerReference w:type="even" r:id="rId12"/>
-      <w:footerReference w:type="default" r:id="rId13"/>
-      <w:headerReference w:type="first" r:id="rId14"/>
-      <w:footerReference w:type="first" r:id="rId15"/>
-      <w:type w:val="continuous"/>
       <w:pgSz w:w="16838" w:h="11906" w:orient="landscape"/>
       <w:pgMar w:top="860" w:right="567" w:bottom="300" w:left="567" w:header="300" w:footer="200" w:gutter="0"/>
       <w:pgNumType w:chapStyle="1"/>

</xml_diff>

<commit_message>
Toplantı Tutanağı Word şablonu: 1. sayfa kısaltıldı (3. sayfaya taşma giderildi)
Co-Authored-By: Claude Sonnet 5.5 <noreply@anthropic.com>
Claude-Session: https://claude.ai/code/session_01J6foNXTwf1dGzDjULYpfrk
</commit_message>
<xml_diff>
--- a/formlar/15. İç Denetim ve Yönetim Gözden Geçirme/EMS.YS.FRM.11.07. Toplantı Tutanağı Formu.docx
+++ b/formlar/15. İç Denetim ve Yönetim Gözden Geçirme/EMS.YS.FRM.11.07. Toplantı Tutanağı Formu.docx
@@ -54,7 +54,7 @@
       </w:tblGrid>
       <w:tr>
         <w:trPr>
-          <w:trHeight w:val="280" w:hRule="atLeast"/>
+          <w:trHeight w:val="250" w:hRule="atLeast"/>
         </w:trPr>
         <w:tc>
           <w:tcPr>
@@ -221,7 +221,7 @@
       </w:tr>
       <w:tr>
         <w:trPr>
-          <w:trHeight w:val="280" w:hRule="atLeast"/>
+          <w:trHeight w:val="250" w:hRule="atLeast"/>
         </w:trPr>
         <w:tc>
           <w:tcPr>
@@ -440,7 +440,7 @@
       </w:tblGrid>
       <w:tr>
         <w:trPr>
-          <w:trHeight w:val="330" w:hRule="atLeast"/>
+          <w:trHeight w:val="280" w:hRule="atLeast"/>
         </w:trPr>
         <w:tc>
           <w:tcPr>
@@ -698,7 +698,7 @@
       </w:tr>
       <w:tr>
         <w:trPr>
-          <w:trHeight w:val="340" w:hRule="atLeast"/>
+          <w:trHeight w:val="262" w:hRule="atLeast"/>
           <w:cantSplit/>
         </w:trPr>
         <w:tc>
@@ -871,7 +871,7 @@
       </w:tr>
       <w:tr>
         <w:trPr>
-          <w:trHeight w:val="340" w:hRule="atLeast"/>
+          <w:trHeight w:val="262" w:hRule="atLeast"/>
           <w:cantSplit/>
         </w:trPr>
         <w:tc>
@@ -1044,7 +1044,7 @@
       </w:tr>
       <w:tr>
         <w:trPr>
-          <w:trHeight w:val="340" w:hRule="atLeast"/>
+          <w:trHeight w:val="262" w:hRule="atLeast"/>
           <w:cantSplit/>
         </w:trPr>
         <w:tc>
@@ -1217,7 +1217,7 @@
       </w:tr>
       <w:tr>
         <w:trPr>
-          <w:trHeight w:val="340" w:hRule="atLeast"/>
+          <w:trHeight w:val="262" w:hRule="atLeast"/>
           <w:cantSplit/>
         </w:trPr>
         <w:tc>
@@ -1390,7 +1390,7 @@
       </w:tr>
       <w:tr>
         <w:trPr>
-          <w:trHeight w:val="340" w:hRule="atLeast"/>
+          <w:trHeight w:val="262" w:hRule="atLeast"/>
           <w:cantSplit/>
         </w:trPr>
         <w:tc>
@@ -1563,7 +1563,7 @@
       </w:tr>
       <w:tr>
         <w:trPr>
-          <w:trHeight w:val="340" w:hRule="atLeast"/>
+          <w:trHeight w:val="262" w:hRule="atLeast"/>
           <w:cantSplit/>
         </w:trPr>
         <w:tc>
@@ -1736,7 +1736,7 @@
       </w:tr>
       <w:tr>
         <w:trPr>
-          <w:trHeight w:val="340" w:hRule="atLeast"/>
+          <w:trHeight w:val="262" w:hRule="atLeast"/>
           <w:cantSplit/>
         </w:trPr>
         <w:tc>
@@ -1909,7 +1909,7 @@
       </w:tr>
       <w:tr>
         <w:trPr>
-          <w:trHeight w:val="340" w:hRule="atLeast"/>
+          <w:trHeight w:val="262" w:hRule="atLeast"/>
           <w:cantSplit/>
         </w:trPr>
         <w:tc>
@@ -2082,7 +2082,7 @@
       </w:tr>
       <w:tr>
         <w:trPr>
-          <w:trHeight w:val="340" w:hRule="atLeast"/>
+          <w:trHeight w:val="262" w:hRule="atLeast"/>
           <w:cantSplit/>
         </w:trPr>
         <w:tc>
@@ -2255,7 +2255,7 @@
       </w:tr>
       <w:tr>
         <w:trPr>
-          <w:trHeight w:val="340" w:hRule="atLeast"/>
+          <w:trHeight w:val="262" w:hRule="atLeast"/>
           <w:cantSplit/>
         </w:trPr>
         <w:tc>
@@ -2477,7 +2477,7 @@
       </w:tblGrid>
       <w:tr>
         <w:trPr>
-          <w:trHeight w:val="330" w:hRule="atLeast"/>
+          <w:trHeight w:val="280" w:hRule="atLeast"/>
         </w:trPr>
         <w:tc>
           <w:tcPr>
@@ -2622,7 +2622,7 @@
       </w:tr>
       <w:tr>
         <w:trPr>
-          <w:trHeight w:val="290" w:hRule="atLeast"/>
+          <w:trHeight w:val="240" w:hRule="atLeast"/>
           <w:cantSplit/>
         </w:trPr>
         <w:tc>
@@ -2659,7 +2659,7 @@
       </w:tr>
       <w:tr>
         <w:trPr>
-          <w:trHeight w:val="295" w:hRule="atLeast"/>
+          <w:trHeight w:val="250" w:hRule="atLeast"/>
           <w:cantSplit/>
         </w:trPr>
         <w:tc>
@@ -2741,7 +2741,7 @@
       </w:tr>
       <w:tr>
         <w:trPr>
-          <w:trHeight w:val="295" w:hRule="atLeast"/>
+          <w:trHeight w:val="250" w:hRule="atLeast"/>
           <w:cantSplit/>
         </w:trPr>
         <w:tc>
@@ -2823,7 +2823,7 @@
       </w:tr>
       <w:tr>
         <w:trPr>
-          <w:trHeight w:val="295" w:hRule="atLeast"/>
+          <w:trHeight w:val="250" w:hRule="atLeast"/>
           <w:cantSplit/>
         </w:trPr>
         <w:tc>
@@ -2905,7 +2905,7 @@
       </w:tr>
       <w:tr>
         <w:trPr>
-          <w:trHeight w:val="295" w:hRule="atLeast"/>
+          <w:trHeight w:val="250" w:hRule="atLeast"/>
           <w:cantSplit/>
         </w:trPr>
         <w:tc>
@@ -2987,7 +2987,7 @@
       </w:tr>
       <w:tr>
         <w:trPr>
-          <w:trHeight w:val="295" w:hRule="atLeast"/>
+          <w:trHeight w:val="250" w:hRule="atLeast"/>
           <w:cantSplit/>
         </w:trPr>
         <w:tc>
@@ -3069,7 +3069,7 @@
       </w:tr>
       <w:tr>
         <w:trPr>
-          <w:trHeight w:val="295" w:hRule="atLeast"/>
+          <w:trHeight w:val="250" w:hRule="atLeast"/>
           <w:cantSplit/>
         </w:trPr>
         <w:tc>
@@ -3196,7 +3196,7 @@
       </w:tblGrid>
       <w:tr>
         <w:trPr>
-          <w:trHeight w:val="330" w:hRule="atLeast"/>
+          <w:trHeight w:val="280" w:hRule="atLeast"/>
         </w:trPr>
         <w:tc>
           <w:tcPr>
@@ -3341,7 +3341,7 @@
       </w:tr>
       <w:tr>
         <w:trPr>
-          <w:trHeight w:val="290" w:hRule="atLeast"/>
+          <w:trHeight w:val="240" w:hRule="atLeast"/>
           <w:cantSplit/>
         </w:trPr>
         <w:tc>
@@ -3378,7 +3378,7 @@
       </w:tr>
       <w:tr>
         <w:trPr>
-          <w:trHeight w:val="295" w:hRule="atLeast"/>
+          <w:trHeight w:val="250" w:hRule="atLeast"/>
           <w:cantSplit/>
         </w:trPr>
         <w:tc>
@@ -3460,7 +3460,7 @@
       </w:tr>
       <w:tr>
         <w:trPr>
-          <w:trHeight w:val="295" w:hRule="atLeast"/>
+          <w:trHeight w:val="250" w:hRule="atLeast"/>
           <w:cantSplit/>
         </w:trPr>
         <w:tc>
@@ -3542,7 +3542,7 @@
       </w:tr>
       <w:tr>
         <w:trPr>
-          <w:trHeight w:val="295" w:hRule="atLeast"/>
+          <w:trHeight w:val="250" w:hRule="atLeast"/>
           <w:cantSplit/>
         </w:trPr>
         <w:tc>
@@ -3624,7 +3624,7 @@
       </w:tr>
       <w:tr>
         <w:trPr>
-          <w:trHeight w:val="295" w:hRule="atLeast"/>
+          <w:trHeight w:val="250" w:hRule="atLeast"/>
           <w:cantSplit/>
         </w:trPr>
         <w:tc>
@@ -3706,7 +3706,7 @@
       </w:tr>
       <w:tr>
         <w:trPr>
-          <w:trHeight w:val="295" w:hRule="atLeast"/>
+          <w:trHeight w:val="250" w:hRule="atLeast"/>
           <w:cantSplit/>
         </w:trPr>
         <w:tc>
@@ -3788,7 +3788,7 @@
       </w:tr>
       <w:tr>
         <w:trPr>
-          <w:trHeight w:val="295" w:hRule="atLeast"/>
+          <w:trHeight w:val="250" w:hRule="atLeast"/>
           <w:cantSplit/>
         </w:trPr>
         <w:tc>
@@ -3870,7 +3870,7 @@
       </w:tr>
       <w:tr>
         <w:trPr>
-          <w:trHeight w:val="290" w:hRule="atLeast"/>
+          <w:trHeight w:val="240" w:hRule="atLeast"/>
           <w:cantSplit/>
         </w:trPr>
         <w:tc>
@@ -3907,7 +3907,7 @@
       </w:tr>
       <w:tr>
         <w:trPr>
-          <w:trHeight w:val="295" w:hRule="atLeast"/>
+          <w:trHeight w:val="250" w:hRule="atLeast"/>
           <w:cantSplit/>
         </w:trPr>
         <w:tc>
@@ -3989,7 +3989,7 @@
       </w:tr>
       <w:tr>
         <w:trPr>
-          <w:trHeight w:val="295" w:hRule="atLeast"/>
+          <w:trHeight w:val="250" w:hRule="atLeast"/>
           <w:cantSplit/>
         </w:trPr>
         <w:tc>
@@ -4071,7 +4071,7 @@
       </w:tr>
       <w:tr>
         <w:trPr>
-          <w:trHeight w:val="295" w:hRule="atLeast"/>
+          <w:trHeight w:val="250" w:hRule="atLeast"/>
           <w:cantSplit/>
         </w:trPr>
         <w:tc>
@@ -4153,7 +4153,7 @@
       </w:tr>
       <w:tr>
         <w:trPr>
-          <w:trHeight w:val="295" w:hRule="atLeast"/>
+          <w:trHeight w:val="250" w:hRule="atLeast"/>
           <w:cantSplit/>
         </w:trPr>
         <w:tc>
@@ -4235,7 +4235,7 @@
       </w:tr>
       <w:tr>
         <w:trPr>
-          <w:trHeight w:val="295" w:hRule="atLeast"/>
+          <w:trHeight w:val="250" w:hRule="atLeast"/>
           <w:cantSplit/>
         </w:trPr>
         <w:tc>
@@ -4317,7 +4317,7 @@
       </w:tr>
       <w:tr>
         <w:trPr>
-          <w:trHeight w:val="295" w:hRule="atLeast"/>
+          <w:trHeight w:val="250" w:hRule="atLeast"/>
           <w:cantSplit/>
         </w:trPr>
         <w:tc>
@@ -4399,7 +4399,7 @@
       </w:tr>
       <w:tr>
         <w:trPr>
-          <w:trHeight w:val="290" w:hRule="atLeast"/>
+          <w:trHeight w:val="240" w:hRule="atLeast"/>
           <w:cantSplit/>
         </w:trPr>
         <w:tc>
@@ -4436,7 +4436,7 @@
       </w:tr>
       <w:tr>
         <w:trPr>
-          <w:trHeight w:val="295" w:hRule="atLeast"/>
+          <w:trHeight w:val="250" w:hRule="atLeast"/>
           <w:cantSplit/>
         </w:trPr>
         <w:tc>
@@ -4518,7 +4518,7 @@
       </w:tr>
       <w:tr>
         <w:trPr>
-          <w:trHeight w:val="295" w:hRule="atLeast"/>
+          <w:trHeight w:val="250" w:hRule="atLeast"/>
           <w:cantSplit/>
         </w:trPr>
         <w:tc>
@@ -4600,7 +4600,7 @@
       </w:tr>
       <w:tr>
         <w:trPr>
-          <w:trHeight w:val="295" w:hRule="atLeast"/>
+          <w:trHeight w:val="250" w:hRule="atLeast"/>
           <w:cantSplit/>
         </w:trPr>
         <w:tc>
@@ -4682,7 +4682,7 @@
       </w:tr>
       <w:tr>
         <w:trPr>
-          <w:trHeight w:val="295" w:hRule="atLeast"/>
+          <w:trHeight w:val="250" w:hRule="atLeast"/>
           <w:cantSplit/>
         </w:trPr>
         <w:tc>
@@ -4764,7 +4764,7 @@
       </w:tr>
       <w:tr>
         <w:trPr>
-          <w:trHeight w:val="295" w:hRule="atLeast"/>
+          <w:trHeight w:val="250" w:hRule="atLeast"/>
           <w:cantSplit/>
         </w:trPr>
         <w:tc>
@@ -4846,7 +4846,7 @@
       </w:tr>
       <w:tr>
         <w:trPr>
-          <w:trHeight w:val="295" w:hRule="atLeast"/>
+          <w:trHeight w:val="250" w:hRule="atLeast"/>
           <w:cantSplit/>
         </w:trPr>
         <w:tc>
@@ -5242,7 +5242,7 @@
     </w:tblGrid>
     <w:tr>
       <w:trPr>
-        <w:trHeight w:val="1300"/>
+        <w:trHeight w:val="1150"/>
       </w:trPr>
       <w:tc>
         <w:tcPr>
@@ -5275,7 +5275,7 @@
             </w:rPr>
             <w:drawing>
               <wp:inline distT="0" distB="0" distL="0" distR="0" wp14:anchorId="151A8098" wp14:editId="34C3FA3F">
-                <wp:extent cx="828000" cy="660000"/>
+                <wp:extent cx="760000" cy="606000"/>
                 <wp:effectExtent l="0" t="0" r="0" b="0"/>
                 <wp:docPr id="38064677" name="Picture 2"/>
                 <wp:cNvGraphicFramePr>
@@ -5306,7 +5306,7 @@
                       <pic:spPr bwMode="auto">
                         <a:xfrm>
                           <a:off x="0" y="0"/>
-                          <a:ext cx="828000" cy="660000"/>
+                          <a:ext cx="760000" cy="606000"/>
                         </a:xfrm>
                         <a:prstGeom prst="rect">
                           <a:avLst/>

</xml_diff>

<commit_message>
Toplantı Tutanağı Word şablonu: 1. sayfa kısaltıldı (3. sayfaya taşma giderildi) (#488)
Claude-Session: https://claude.ai/code/session_01J6foNXTwf1dGzDjULYpfrk

Co-authored-by: Claude <noreply@anthropic.com>
</commit_message>
<xml_diff>
--- a/formlar/15. İç Denetim ve Yönetim Gözden Geçirme/EMS.YS.FRM.11.07. Toplantı Tutanağı Formu.docx
+++ b/formlar/15. İç Denetim ve Yönetim Gözden Geçirme/EMS.YS.FRM.11.07. Toplantı Tutanağı Formu.docx
@@ -54,7 +54,7 @@
       </w:tblGrid>
       <w:tr>
         <w:trPr>
-          <w:trHeight w:val="280" w:hRule="atLeast"/>
+          <w:trHeight w:val="250" w:hRule="atLeast"/>
         </w:trPr>
         <w:tc>
           <w:tcPr>
@@ -221,7 +221,7 @@
       </w:tr>
       <w:tr>
         <w:trPr>
-          <w:trHeight w:val="280" w:hRule="atLeast"/>
+          <w:trHeight w:val="250" w:hRule="atLeast"/>
         </w:trPr>
         <w:tc>
           <w:tcPr>
@@ -440,7 +440,7 @@
       </w:tblGrid>
       <w:tr>
         <w:trPr>
-          <w:trHeight w:val="330" w:hRule="atLeast"/>
+          <w:trHeight w:val="280" w:hRule="atLeast"/>
         </w:trPr>
         <w:tc>
           <w:tcPr>
@@ -698,7 +698,7 @@
       </w:tr>
       <w:tr>
         <w:trPr>
-          <w:trHeight w:val="340" w:hRule="atLeast"/>
+          <w:trHeight w:val="262" w:hRule="atLeast"/>
           <w:cantSplit/>
         </w:trPr>
         <w:tc>
@@ -871,7 +871,7 @@
       </w:tr>
       <w:tr>
         <w:trPr>
-          <w:trHeight w:val="340" w:hRule="atLeast"/>
+          <w:trHeight w:val="262" w:hRule="atLeast"/>
           <w:cantSplit/>
         </w:trPr>
         <w:tc>
@@ -1044,7 +1044,7 @@
       </w:tr>
       <w:tr>
         <w:trPr>
-          <w:trHeight w:val="340" w:hRule="atLeast"/>
+          <w:trHeight w:val="262" w:hRule="atLeast"/>
           <w:cantSplit/>
         </w:trPr>
         <w:tc>
@@ -1217,7 +1217,7 @@
       </w:tr>
       <w:tr>
         <w:trPr>
-          <w:trHeight w:val="340" w:hRule="atLeast"/>
+          <w:trHeight w:val="262" w:hRule="atLeast"/>
           <w:cantSplit/>
         </w:trPr>
         <w:tc>
@@ -1390,7 +1390,7 @@
       </w:tr>
       <w:tr>
         <w:trPr>
-          <w:trHeight w:val="340" w:hRule="atLeast"/>
+          <w:trHeight w:val="262" w:hRule="atLeast"/>
           <w:cantSplit/>
         </w:trPr>
         <w:tc>
@@ -1563,7 +1563,7 @@
       </w:tr>
       <w:tr>
         <w:trPr>
-          <w:trHeight w:val="340" w:hRule="atLeast"/>
+          <w:trHeight w:val="262" w:hRule="atLeast"/>
           <w:cantSplit/>
         </w:trPr>
         <w:tc>
@@ -1736,7 +1736,7 @@
       </w:tr>
       <w:tr>
         <w:trPr>
-          <w:trHeight w:val="340" w:hRule="atLeast"/>
+          <w:trHeight w:val="262" w:hRule="atLeast"/>
           <w:cantSplit/>
         </w:trPr>
         <w:tc>
@@ -1909,7 +1909,7 @@
       </w:tr>
       <w:tr>
         <w:trPr>
-          <w:trHeight w:val="340" w:hRule="atLeast"/>
+          <w:trHeight w:val="262" w:hRule="atLeast"/>
           <w:cantSplit/>
         </w:trPr>
         <w:tc>
@@ -2082,7 +2082,7 @@
       </w:tr>
       <w:tr>
         <w:trPr>
-          <w:trHeight w:val="340" w:hRule="atLeast"/>
+          <w:trHeight w:val="262" w:hRule="atLeast"/>
           <w:cantSplit/>
         </w:trPr>
         <w:tc>
@@ -2255,7 +2255,7 @@
       </w:tr>
       <w:tr>
         <w:trPr>
-          <w:trHeight w:val="340" w:hRule="atLeast"/>
+          <w:trHeight w:val="262" w:hRule="atLeast"/>
           <w:cantSplit/>
         </w:trPr>
         <w:tc>
@@ -2477,7 +2477,7 @@
       </w:tblGrid>
       <w:tr>
         <w:trPr>
-          <w:trHeight w:val="330" w:hRule="atLeast"/>
+          <w:trHeight w:val="280" w:hRule="atLeast"/>
         </w:trPr>
         <w:tc>
           <w:tcPr>
@@ -2622,7 +2622,7 @@
       </w:tr>
       <w:tr>
         <w:trPr>
-          <w:trHeight w:val="290" w:hRule="atLeast"/>
+          <w:trHeight w:val="240" w:hRule="atLeast"/>
           <w:cantSplit/>
         </w:trPr>
         <w:tc>
@@ -2659,7 +2659,7 @@
       </w:tr>
       <w:tr>
         <w:trPr>
-          <w:trHeight w:val="295" w:hRule="atLeast"/>
+          <w:trHeight w:val="250" w:hRule="atLeast"/>
           <w:cantSplit/>
         </w:trPr>
         <w:tc>
@@ -2741,7 +2741,7 @@
       </w:tr>
       <w:tr>
         <w:trPr>
-          <w:trHeight w:val="295" w:hRule="atLeast"/>
+          <w:trHeight w:val="250" w:hRule="atLeast"/>
           <w:cantSplit/>
         </w:trPr>
         <w:tc>
@@ -2823,7 +2823,7 @@
       </w:tr>
       <w:tr>
         <w:trPr>
-          <w:trHeight w:val="295" w:hRule="atLeast"/>
+          <w:trHeight w:val="250" w:hRule="atLeast"/>
           <w:cantSplit/>
         </w:trPr>
         <w:tc>
@@ -2905,7 +2905,7 @@
       </w:tr>
       <w:tr>
         <w:trPr>
-          <w:trHeight w:val="295" w:hRule="atLeast"/>
+          <w:trHeight w:val="250" w:hRule="atLeast"/>
           <w:cantSplit/>
         </w:trPr>
         <w:tc>
@@ -2987,7 +2987,7 @@
       </w:tr>
       <w:tr>
         <w:trPr>
-          <w:trHeight w:val="295" w:hRule="atLeast"/>
+          <w:trHeight w:val="250" w:hRule="atLeast"/>
           <w:cantSplit/>
         </w:trPr>
         <w:tc>
@@ -3069,7 +3069,7 @@
       </w:tr>
       <w:tr>
         <w:trPr>
-          <w:trHeight w:val="295" w:hRule="atLeast"/>
+          <w:trHeight w:val="250" w:hRule="atLeast"/>
           <w:cantSplit/>
         </w:trPr>
         <w:tc>
@@ -3196,7 +3196,7 @@
       </w:tblGrid>
       <w:tr>
         <w:trPr>
-          <w:trHeight w:val="330" w:hRule="atLeast"/>
+          <w:trHeight w:val="280" w:hRule="atLeast"/>
         </w:trPr>
         <w:tc>
           <w:tcPr>
@@ -3341,7 +3341,7 @@
       </w:tr>
       <w:tr>
         <w:trPr>
-          <w:trHeight w:val="290" w:hRule="atLeast"/>
+          <w:trHeight w:val="240" w:hRule="atLeast"/>
           <w:cantSplit/>
         </w:trPr>
         <w:tc>
@@ -3378,7 +3378,7 @@
       </w:tr>
       <w:tr>
         <w:trPr>
-          <w:trHeight w:val="295" w:hRule="atLeast"/>
+          <w:trHeight w:val="250" w:hRule="atLeast"/>
           <w:cantSplit/>
         </w:trPr>
         <w:tc>
@@ -3460,7 +3460,7 @@
       </w:tr>
       <w:tr>
         <w:trPr>
-          <w:trHeight w:val="295" w:hRule="atLeast"/>
+          <w:trHeight w:val="250" w:hRule="atLeast"/>
           <w:cantSplit/>
         </w:trPr>
         <w:tc>
@@ -3542,7 +3542,7 @@
       </w:tr>
       <w:tr>
         <w:trPr>
-          <w:trHeight w:val="295" w:hRule="atLeast"/>
+          <w:trHeight w:val="250" w:hRule="atLeast"/>
           <w:cantSplit/>
         </w:trPr>
         <w:tc>
@@ -3624,7 +3624,7 @@
       </w:tr>
       <w:tr>
         <w:trPr>
-          <w:trHeight w:val="295" w:hRule="atLeast"/>
+          <w:trHeight w:val="250" w:hRule="atLeast"/>
           <w:cantSplit/>
         </w:trPr>
         <w:tc>
@@ -3706,7 +3706,7 @@
       </w:tr>
       <w:tr>
         <w:trPr>
-          <w:trHeight w:val="295" w:hRule="atLeast"/>
+          <w:trHeight w:val="250" w:hRule="atLeast"/>
           <w:cantSplit/>
         </w:trPr>
         <w:tc>
@@ -3788,7 +3788,7 @@
       </w:tr>
       <w:tr>
         <w:trPr>
-          <w:trHeight w:val="295" w:hRule="atLeast"/>
+          <w:trHeight w:val="250" w:hRule="atLeast"/>
           <w:cantSplit/>
         </w:trPr>
         <w:tc>
@@ -3870,7 +3870,7 @@
       </w:tr>
       <w:tr>
         <w:trPr>
-          <w:trHeight w:val="290" w:hRule="atLeast"/>
+          <w:trHeight w:val="240" w:hRule="atLeast"/>
           <w:cantSplit/>
         </w:trPr>
         <w:tc>
@@ -3907,7 +3907,7 @@
       </w:tr>
       <w:tr>
         <w:trPr>
-          <w:trHeight w:val="295" w:hRule="atLeast"/>
+          <w:trHeight w:val="250" w:hRule="atLeast"/>
           <w:cantSplit/>
         </w:trPr>
         <w:tc>
@@ -3989,7 +3989,7 @@
       </w:tr>
       <w:tr>
         <w:trPr>
-          <w:trHeight w:val="295" w:hRule="atLeast"/>
+          <w:trHeight w:val="250" w:hRule="atLeast"/>
           <w:cantSplit/>
         </w:trPr>
         <w:tc>
@@ -4071,7 +4071,7 @@
       </w:tr>
       <w:tr>
         <w:trPr>
-          <w:trHeight w:val="295" w:hRule="atLeast"/>
+          <w:trHeight w:val="250" w:hRule="atLeast"/>
           <w:cantSplit/>
         </w:trPr>
         <w:tc>
@@ -4153,7 +4153,7 @@
       </w:tr>
       <w:tr>
         <w:trPr>
-          <w:trHeight w:val="295" w:hRule="atLeast"/>
+          <w:trHeight w:val="250" w:hRule="atLeast"/>
           <w:cantSplit/>
         </w:trPr>
         <w:tc>
@@ -4235,7 +4235,7 @@
       </w:tr>
       <w:tr>
         <w:trPr>
-          <w:trHeight w:val="295" w:hRule="atLeast"/>
+          <w:trHeight w:val="250" w:hRule="atLeast"/>
           <w:cantSplit/>
         </w:trPr>
         <w:tc>
@@ -4317,7 +4317,7 @@
       </w:tr>
       <w:tr>
         <w:trPr>
-          <w:trHeight w:val="295" w:hRule="atLeast"/>
+          <w:trHeight w:val="250" w:hRule="atLeast"/>
           <w:cantSplit/>
         </w:trPr>
         <w:tc>
@@ -4399,7 +4399,7 @@
       </w:tr>
       <w:tr>
         <w:trPr>
-          <w:trHeight w:val="290" w:hRule="atLeast"/>
+          <w:trHeight w:val="240" w:hRule="atLeast"/>
           <w:cantSplit/>
         </w:trPr>
         <w:tc>
@@ -4436,7 +4436,7 @@
       </w:tr>
       <w:tr>
         <w:trPr>
-          <w:trHeight w:val="295" w:hRule="atLeast"/>
+          <w:trHeight w:val="250" w:hRule="atLeast"/>
           <w:cantSplit/>
         </w:trPr>
         <w:tc>
@@ -4518,7 +4518,7 @@
       </w:tr>
       <w:tr>
         <w:trPr>
-          <w:trHeight w:val="295" w:hRule="atLeast"/>
+          <w:trHeight w:val="250" w:hRule="atLeast"/>
           <w:cantSplit/>
         </w:trPr>
         <w:tc>
@@ -4600,7 +4600,7 @@
       </w:tr>
       <w:tr>
         <w:trPr>
-          <w:trHeight w:val="295" w:hRule="atLeast"/>
+          <w:trHeight w:val="250" w:hRule="atLeast"/>
           <w:cantSplit/>
         </w:trPr>
         <w:tc>
@@ -4682,7 +4682,7 @@
       </w:tr>
       <w:tr>
         <w:trPr>
-          <w:trHeight w:val="295" w:hRule="atLeast"/>
+          <w:trHeight w:val="250" w:hRule="atLeast"/>
           <w:cantSplit/>
         </w:trPr>
         <w:tc>
@@ -4764,7 +4764,7 @@
       </w:tr>
       <w:tr>
         <w:trPr>
-          <w:trHeight w:val="295" w:hRule="atLeast"/>
+          <w:trHeight w:val="250" w:hRule="atLeast"/>
           <w:cantSplit/>
         </w:trPr>
         <w:tc>
@@ -4846,7 +4846,7 @@
       </w:tr>
       <w:tr>
         <w:trPr>
-          <w:trHeight w:val="295" w:hRule="atLeast"/>
+          <w:trHeight w:val="250" w:hRule="atLeast"/>
           <w:cantSplit/>
         </w:trPr>
         <w:tc>
@@ -5242,7 +5242,7 @@
     </w:tblGrid>
     <w:tr>
       <w:trPr>
-        <w:trHeight w:val="1300"/>
+        <w:trHeight w:val="1150"/>
       </w:trPr>
       <w:tc>
         <w:tcPr>
@@ -5275,7 +5275,7 @@
             </w:rPr>
             <w:drawing>
               <wp:inline distT="0" distB="0" distL="0" distR="0" wp14:anchorId="151A8098" wp14:editId="34C3FA3F">
-                <wp:extent cx="828000" cy="660000"/>
+                <wp:extent cx="760000" cy="606000"/>
                 <wp:effectExtent l="0" t="0" r="0" b="0"/>
                 <wp:docPr id="38064677" name="Picture 2"/>
                 <wp:cNvGraphicFramePr>
@@ -5306,7 +5306,7 @@
                       <pic:spPr bwMode="auto">
                         <a:xfrm>
                           <a:off x="0" y="0"/>
-                          <a:ext cx="828000" cy="660000"/>
+                          <a:ext cx="760000" cy="606000"/>
                         </a:xfrm>
                         <a:prstGeom prst="rect">
                           <a:avLst/>

</xml_diff>